<commit_message>
done for the rest of the month
</commit_message>
<xml_diff>
--- a/2B21-05_group_submission.docx
+++ b/2B21-05_group_submission.docx
@@ -1,6 +1,6 @@
 
 <file path=word/document.xml><?xml version="1.0" encoding="utf-8"?>
-<w:document xmlns:wpc="http://schemas.microsoft.com/office/word/2010/wordprocessingCanvas" xmlns:cx="http://schemas.microsoft.com/office/drawing/2014/chartex" xmlns:cx1="http://schemas.microsoft.com/office/drawing/2015/9/8/chartex" xmlns:cx2="http://schemas.microsoft.com/office/drawing/2015/10/21/chartex" xmlns:cx3="http://schemas.microsoft.com/office/drawing/2016/5/9/chartex" xmlns:cx4="http://schemas.microsoft.com/office/drawing/2016/5/10/chartex" xmlns:cx5="http://schemas.microsoft.com/office/drawing/2016/5/11/chartex" xmlns:cx6="http://schemas.microsoft.com/office/drawing/2016/5/12/chartex" xmlns:cx7="http://schemas.microsoft.com/office/drawing/2016/5/13/chartex" xmlns:cx8="http://schemas.microsoft.com/office/drawing/2016/5/14/chartex" xmlns:mc="http://schemas.openxmlformats.org/markup-compatibility/2006" xmlns:aink="http://schemas.microsoft.com/office/drawing/2016/ink" xmlns:am3d="http://schemas.microsoft.com/office/drawing/2017/model3d" xmlns:o="urn:schemas-microsoft-com:office:office" xmlns:oel="http://schemas.microsoft.com/office/2019/extlst" xmlns:r="http://schemas.openxmlformats.org/officeDocument/2006/relationships" xmlns:m="http://schemas.openxmlformats.org/officeDocument/2006/math" xmlns:v="urn:schemas-microsoft-com:vml" xmlns:wp14="http://schemas.microsoft.com/office/word/2010/wordprocessingDrawing" xmlns:wp="http://schemas.openxmlformats.org/drawingml/2006/wordprocessingDrawing" xmlns:w10="urn:schemas-microsoft-com:office:word" xmlns:w="http://schemas.openxmlformats.org/wordprocessingml/2006/main" xmlns:w14="http://schemas.microsoft.com/office/word/2010/wordml" xmlns:w15="http://schemas.microsoft.com/office/word/2012/wordml" xmlns:w16cex="http://schemas.microsoft.com/office/word/2018/wordml/cex" xmlns:w16cid="http://schemas.microsoft.com/office/word/2016/wordml/cid" xmlns:w16="http://schemas.microsoft.com/office/word/2018/wordml" xmlns:w16sdtdh="http://schemas.microsoft.com/office/word/2020/wordml/sdtdatahash" xmlns:w16se="http://schemas.microsoft.com/office/word/2015/wordml/symex" xmlns:wpg="http://schemas.microsoft.com/office/word/2010/wordprocessingGroup" xmlns:wpi="http://schemas.microsoft.com/office/word/2010/wordprocessingInk" xmlns:wne="http://schemas.microsoft.com/office/word/2006/wordml" xmlns:wps="http://schemas.microsoft.com/office/word/2010/wordprocessingShape" mc:Ignorable="w14 w15 w16se w16cid w16 w16cex w16sdtdh wp14">
+<w:document xmlns:wpc="http://schemas.microsoft.com/office/word/2010/wordprocessingCanvas" xmlns:cx="http://schemas.microsoft.com/office/drawing/2014/chartex" xmlns:cx1="http://schemas.microsoft.com/office/drawing/2015/9/8/chartex" xmlns:cx2="http://schemas.microsoft.com/office/drawing/2015/10/21/chartex" xmlns:cx3="http://schemas.microsoft.com/office/drawing/2016/5/9/chartex" xmlns:cx4="http://schemas.microsoft.com/office/drawing/2016/5/10/chartex" xmlns:cx5="http://schemas.microsoft.com/office/drawing/2016/5/11/chartex" xmlns:cx6="http://schemas.microsoft.com/office/drawing/2016/5/12/chartex" xmlns:cx7="http://schemas.microsoft.com/office/drawing/2016/5/13/chartex" xmlns:cx8="http://schemas.microsoft.com/office/drawing/2016/5/14/chartex" xmlns:mc="http://schemas.openxmlformats.org/markup-compatibility/2006" xmlns:aink="http://schemas.microsoft.com/office/drawing/2016/ink" xmlns:am3d="http://schemas.microsoft.com/office/drawing/2017/model3d" xmlns:o="urn:schemas-microsoft-com:office:office" xmlns:oel="http://schemas.microsoft.com/office/2019/extlst" xmlns:r="http://schemas.openxmlformats.org/officeDocument/2006/relationships" xmlns:m="http://schemas.openxmlformats.org/officeDocument/2006/math" xmlns:v="urn:schemas-microsoft-com:vml" xmlns:wp14="http://schemas.microsoft.com/office/word/2010/wordprocessingDrawing" xmlns:wp="http://schemas.openxmlformats.org/drawingml/2006/wordprocessingDrawing" xmlns:w10="urn:schemas-microsoft-com:office:word" xmlns:w="http://schemas.openxmlformats.org/wordprocessingml/2006/main" xmlns:w14="http://schemas.microsoft.com/office/word/2010/wordml" xmlns:w15="http://schemas.microsoft.com/office/word/2012/wordml" xmlns:w16cex="http://schemas.microsoft.com/office/word/2018/wordml/cex" xmlns:w16cid="http://schemas.microsoft.com/office/word/2016/wordml/cid" xmlns:w16="http://schemas.microsoft.com/office/word/2018/wordml" xmlns:w16du="http://schemas.microsoft.com/office/word/2023/wordml/word16du" xmlns:w16sdtdh="http://schemas.microsoft.com/office/word/2020/wordml/sdtdatahash" xmlns:w16sdtfl="http://schemas.microsoft.com/office/word/2024/wordml/sdtformatlock" xmlns:w16se="http://schemas.microsoft.com/office/word/2015/wordml/symex" xmlns:wpg="http://schemas.microsoft.com/office/word/2010/wordprocessingGroup" xmlns:wpi="http://schemas.microsoft.com/office/word/2010/wordprocessingInk" xmlns:wne="http://schemas.microsoft.com/office/word/2006/wordml" xmlns:wps="http://schemas.microsoft.com/office/word/2010/wordprocessingShape" mc:Ignorable="w14 w15 w16se w16cid w16 w16cex w16sdtdh w16sdtfl w16du wp14">
   <w:body>
     <w:bookmarkStart w:id="0" w:name="_Hlk198869228"/>
     <w:p>
@@ -89,7 +89,7 @@
               </wp:anchor>
             </w:drawing>
           </mc:Choice>
-          <mc:Fallback xmlns:w16sdtfl="http://schemas.microsoft.com/office/word/2024/wordml/sdtformatlock" xmlns:w16du="http://schemas.microsoft.com/office/word/2023/wordml/word16du">
+          <mc:Fallback>
             <w:pict>
               <v:rect w14:anchorId="442B718D" id="Rectangle 4" o:spid="_x0000_s1026" style="position:absolute;margin-left:-27.75pt;margin-top:-18.75pt;width:49.8pt;height:774.75pt;z-index:-251658240;visibility:visible;mso-wrap-style:square;mso-width-percent:0;mso-height-percent:0;mso-wrap-distance-left:9pt;mso-wrap-distance-top:0;mso-wrap-distance-right:9pt;mso-wrap-distance-bottom:0;mso-position-horizontal:absolute;mso-position-horizontal-relative:text;mso-position-vertical:absolute;mso-position-vertical-relative:text;mso-width-percent:0;mso-height-percent:0;mso-width-relative:margin;mso-height-relative:margin;v-text-anchor:middle" o:gfxdata="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" fillcolor="#92d050" stroked="f" strokeweight="2pt"/>
             </w:pict>
@@ -194,7 +194,7 @@
           </w:tcPr>
           <w:p>
             <w:r>
-              <w:t>Kendrick Slamat (Leader)</w:t>
+              <w:t xml:space="preserve">Kendrick Slamat </w:t>
             </w:r>
           </w:p>
         </w:tc>
@@ -204,7 +204,7 @@
           </w:tcPr>
           <w:p>
             <w:r>
-              <w:t>33.3</w:t>
+              <w:t>25</w:t>
             </w:r>
           </w:p>
         </w:tc>
@@ -239,7 +239,7 @@
           </w:tcPr>
           <w:p>
             <w:r>
-              <w:t>33.3</w:t>
+              <w:t>25</w:t>
             </w:r>
           </w:p>
         </w:tc>
@@ -266,6 +266,9 @@
             <w:r>
               <w:t>Chin Guan Chung</w:t>
             </w:r>
+            <w:r>
+              <w:t xml:space="preserve"> (Leader)</w:t>
+            </w:r>
           </w:p>
         </w:tc>
         <w:tc>
@@ -274,7 +277,7 @@
           </w:tcPr>
           <w:p>
             <w:r>
-              <w:t>33.4</w:t>
+              <w:t>25</w:t>
             </w:r>
           </w:p>
         </w:tc>
@@ -287,19 +290,31 @@
           <w:tcPr>
             <w:tcW w:w="1980" w:type="dxa"/>
           </w:tcPr>
-          <w:p/>
+          <w:p>
+            <w:r>
+              <w:t>P2518507</w:t>
+            </w:r>
+          </w:p>
         </w:tc>
         <w:tc>
           <w:tcPr>
             <w:tcW w:w="4252" w:type="dxa"/>
           </w:tcPr>
-          <w:p/>
+          <w:p>
+            <w:r>
+              <w:t>Hannah How</w:t>
+            </w:r>
+          </w:p>
         </w:tc>
         <w:tc>
           <w:tcPr>
             <w:tcW w:w="2489" w:type="dxa"/>
           </w:tcPr>
-          <w:p/>
+          <w:p>
+            <w:r>
+              <w:t>25</w:t>
+            </w:r>
+          </w:p>
         </w:tc>
       </w:tr>
     </w:tbl>
@@ -474,7 +489,7 @@
               </wp:anchor>
             </w:drawing>
           </mc:Choice>
-          <mc:Fallback xmlns:w16sdtfl="http://schemas.microsoft.com/office/word/2024/wordml/sdtformatlock" xmlns:w16du="http://schemas.microsoft.com/office/word/2023/wordml/word16du">
+          <mc:Fallback>
             <w:pict>
               <v:shapetype w14:anchorId="314475A8" id="_x0000_t202" coordsize="21600,21600" o:spt="202" path="m,l,21600r21600,l21600,xe">
                 <v:stroke joinstyle="miter"/>
@@ -826,34 +841,7 @@
                                     <w:u w:val="single"/>
                                     <w:lang w:val="en-SG"/>
                                   </w:rPr>
-                                  <w:tab/>
-                                </w:r>
-                                <w:r>
-                                  <w:rPr>
-                                    <w:b/>
-                                    <w:sz w:val="32"/>
-                                    <w:u w:val="single"/>
-                                    <w:lang w:val="en-SG"/>
-                                  </w:rPr>
-                                  <w:tab/>
-                                </w:r>
-                                <w:r>
-                                  <w:rPr>
-                                    <w:b/>
-                                    <w:sz w:val="32"/>
-                                    <w:u w:val="single"/>
-                                    <w:lang w:val="en-SG"/>
-                                  </w:rPr>
-                                  <w:tab/>
-                                </w:r>
-                                <w:r>
-                                  <w:rPr>
-                                    <w:b/>
-                                    <w:sz w:val="32"/>
-                                    <w:u w:val="single"/>
-                                    <w:lang w:val="en-SG"/>
-                                  </w:rPr>
-                                  <w:tab/>
+                                  <w:t>DAAA/FT/2B/21</w:t>
                                 </w:r>
                               </w:p>
                               <w:p>
@@ -895,34 +883,7 @@
                                     <w:u w:val="single"/>
                                     <w:lang w:val="en-SG"/>
                                   </w:rPr>
-                                  <w:tab/>
-                                </w:r>
-                                <w:r>
-                                  <w:rPr>
-                                    <w:b/>
-                                    <w:sz w:val="32"/>
-                                    <w:u w:val="single"/>
-                                    <w:lang w:val="en-SG"/>
-                                  </w:rPr>
-                                  <w:tab/>
-                                </w:r>
-                                <w:r>
-                                  <w:rPr>
-                                    <w:b/>
-                                    <w:sz w:val="32"/>
-                                    <w:u w:val="single"/>
-                                    <w:lang w:val="en-SG"/>
-                                  </w:rPr>
-                                  <w:tab/>
-                                </w:r>
-                                <w:r>
-                                  <w:rPr>
-                                    <w:b/>
-                                    <w:sz w:val="32"/>
-                                    <w:u w:val="single"/>
-                                    <w:lang w:val="en-SG"/>
-                                  </w:rPr>
-                                  <w:tab/>
+                                  <w:t>Group 4</w:t>
                                 </w:r>
                               </w:p>
                               <w:p>
@@ -960,9 +921,13 @@
                   </wp:anchor>
                 </w:drawing>
               </mc:Choice>
-              <mc:Fallback xmlns:w16sdtfl="http://schemas.microsoft.com/office/word/2024/wordml/sdtformatlock" xmlns:w16du="http://schemas.microsoft.com/office/word/2023/wordml/word16du">
+              <mc:Fallback>
                 <w:pict>
-                  <v:shape w14:anchorId="613D5061" id="Text Box 2" o:spid="_x0000_s1027" type="#_x0000_t202" style="position:absolute;margin-left:54pt;margin-top:343.7pt;width:424.2pt;height:189.6pt;z-index:251658244;visibility:visible;mso-wrap-style:square;mso-width-percent:0;mso-height-percent:0;mso-wrap-distance-left:9pt;mso-wrap-distance-top:3.6pt;mso-wrap-distance-right:9pt;mso-wrap-distance-bottom:3.6pt;mso-position-horizontal:absolute;mso-position-horizontal-relative:text;mso-position-vertical:absolute;mso-position-vertical-relative:text;mso-width-percent:0;mso-height-percent:0;mso-width-relative:margin;mso-height-relative:margin;v-text-anchor:top" o:gfxdata="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" filled="f" strokecolor="#4e6128 [1606]">
+                  <v:shapetype w14:anchorId="613D5061" id="_x0000_t202" coordsize="21600,21600" o:spt="202" path="m,l,21600r21600,l21600,xe">
+                    <v:stroke joinstyle="miter"/>
+                    <v:path gradientshapeok="t" o:connecttype="rect"/>
+                  </v:shapetype>
+                  <v:shape id="Text Box 2" o:spid="_x0000_s1027" type="#_x0000_t202" style="position:absolute;margin-left:54pt;margin-top:343.7pt;width:424.2pt;height:189.6pt;z-index:251658244;visibility:visible;mso-wrap-style:square;mso-width-percent:0;mso-height-percent:0;mso-wrap-distance-left:9pt;mso-wrap-distance-top:3.6pt;mso-wrap-distance-right:9pt;mso-wrap-distance-bottom:3.6pt;mso-position-horizontal:absolute;mso-position-horizontal-relative:text;mso-position-vertical:absolute;mso-position-vertical-relative:text;mso-width-percent:0;mso-height-percent:0;mso-width-relative:margin;mso-height-relative:margin;v-text-anchor:top" o:gfxdata="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" filled="f" strokecolor="#4e6128 [1606]">
                     <v:stroke dashstyle="dash"/>
                     <v:textbox inset="3mm,3mm,3mm,3mm">
                       <w:txbxContent>
@@ -1136,34 +1101,7 @@
                               <w:u w:val="single"/>
                               <w:lang w:val="en-SG"/>
                             </w:rPr>
-                            <w:tab/>
-                          </w:r>
-                          <w:r>
-                            <w:rPr>
-                              <w:b/>
-                              <w:sz w:val="32"/>
-                              <w:u w:val="single"/>
-                              <w:lang w:val="en-SG"/>
-                            </w:rPr>
-                            <w:tab/>
-                          </w:r>
-                          <w:r>
-                            <w:rPr>
-                              <w:b/>
-                              <w:sz w:val="32"/>
-                              <w:u w:val="single"/>
-                              <w:lang w:val="en-SG"/>
-                            </w:rPr>
-                            <w:tab/>
-                          </w:r>
-                          <w:r>
-                            <w:rPr>
-                              <w:b/>
-                              <w:sz w:val="32"/>
-                              <w:u w:val="single"/>
-                              <w:lang w:val="en-SG"/>
-                            </w:rPr>
-                            <w:tab/>
+                            <w:t>DAAA/FT/2B/21</w:t>
                           </w:r>
                         </w:p>
                         <w:p>
@@ -1205,34 +1143,7 @@
                               <w:u w:val="single"/>
                               <w:lang w:val="en-SG"/>
                             </w:rPr>
-                            <w:tab/>
-                          </w:r>
-                          <w:r>
-                            <w:rPr>
-                              <w:b/>
-                              <w:sz w:val="32"/>
-                              <w:u w:val="single"/>
-                              <w:lang w:val="en-SG"/>
-                            </w:rPr>
-                            <w:tab/>
-                          </w:r>
-                          <w:r>
-                            <w:rPr>
-                              <w:b/>
-                              <w:sz w:val="32"/>
-                              <w:u w:val="single"/>
-                              <w:lang w:val="en-SG"/>
-                            </w:rPr>
-                            <w:tab/>
-                          </w:r>
-                          <w:r>
-                            <w:rPr>
-                              <w:b/>
-                              <w:sz w:val="32"/>
-                              <w:u w:val="single"/>
-                              <w:lang w:val="en-SG"/>
-                            </w:rPr>
-                            <w:tab/>
+                            <w:t>Group 4</w:t>
                           </w:r>
                         </w:p>
                         <w:p>
@@ -2036,7 +1947,7 @@
                   </wp:anchor>
                 </w:drawing>
               </mc:Choice>
-              <mc:Fallback xmlns:w16sdtfl="http://schemas.microsoft.com/office/word/2024/wordml/sdtformatlock" xmlns:w16du="http://schemas.microsoft.com/office/word/2023/wordml/word16du">
+              <mc:Fallback>
                 <w:pict>
                   <v:shapetype w14:anchorId="48561284" id="_x0000_t15" coordsize="21600,21600" o:spt="15" adj="16200" path="m@0,l,,,21600@0,21600,21600,10800xe">
                     <v:stroke joinstyle="miter"/>
@@ -2290,7 +2201,7 @@
       <w:tr>
         <w:tc>
           <w:tcPr>
-            <w:tcW w:type="dxa" w:w="1705"/>
+            <w:tcW w:w="1705" w:type="dxa"/>
           </w:tcPr>
           <w:p>
             <w:r>
@@ -2303,7 +2214,7 @@
         </w:tc>
         <w:tc>
           <w:tcPr>
-            <w:tcW w:type="dxa" w:w="1620"/>
+            <w:tcW w:w="1620" w:type="dxa"/>
           </w:tcPr>
           <w:p>
             <w:r>
@@ -2316,7 +2227,7 @@
         </w:tc>
         <w:tc>
           <w:tcPr>
-            <w:tcW w:type="dxa" w:w="2700"/>
+            <w:tcW w:w="2700" w:type="dxa"/>
           </w:tcPr>
           <w:p>
             <w:r>
@@ -2329,7 +2240,7 @@
         </w:tc>
         <w:tc>
           <w:tcPr>
-            <w:tcW w:type="dxa" w:w="2994"/>
+            <w:tcW w:w="2994" w:type="dxa"/>
           </w:tcPr>
           <w:p>
             <w:r>
@@ -2344,7 +2255,7 @@
       <w:tr>
         <w:tc>
           <w:tcPr>
-            <w:tcW w:type="dxa" w:w="1705"/>
+            <w:tcW w:w="1705" w:type="dxa"/>
           </w:tcPr>
           <w:p>
             <w:r>
@@ -2357,7 +2268,7 @@
         </w:tc>
         <w:tc>
           <w:tcPr>
-            <w:tcW w:type="dxa" w:w="1620"/>
+            <w:tcW w:w="1620" w:type="dxa"/>
           </w:tcPr>
           <w:p>
             <w:r>
@@ -2370,7 +2281,7 @@
         </w:tc>
         <w:tc>
           <w:tcPr>
-            <w:tcW w:type="dxa" w:w="2700"/>
+            <w:tcW w:w="2700" w:type="dxa"/>
           </w:tcPr>
           <w:p>
             <w:r>
@@ -2383,7 +2294,7 @@
         </w:tc>
         <w:tc>
           <w:tcPr>
-            <w:tcW w:type="dxa" w:w="2994"/>
+            <w:tcW w:w="2994" w:type="dxa"/>
           </w:tcPr>
           <w:p>
             <w:r>
@@ -2398,7 +2309,7 @@
       <w:tr>
         <w:tc>
           <w:tcPr>
-            <w:tcW w:type="dxa" w:w="1705"/>
+            <w:tcW w:w="1705" w:type="dxa"/>
           </w:tcPr>
           <w:p>
             <w:r>
@@ -2411,7 +2322,7 @@
         </w:tc>
         <w:tc>
           <w:tcPr>
-            <w:tcW w:type="dxa" w:w="1620"/>
+            <w:tcW w:w="1620" w:type="dxa"/>
           </w:tcPr>
           <w:p>
             <w:r>
@@ -2424,7 +2335,7 @@
         </w:tc>
         <w:tc>
           <w:tcPr>
-            <w:tcW w:type="dxa" w:w="2700"/>
+            <w:tcW w:w="2700" w:type="dxa"/>
           </w:tcPr>
           <w:p>
             <w:r>
@@ -2437,7 +2348,7 @@
         </w:tc>
         <w:tc>
           <w:tcPr>
-            <w:tcW w:type="dxa" w:w="2994"/>
+            <w:tcW w:w="2994" w:type="dxa"/>
           </w:tcPr>
           <w:p>
             <w:r>
@@ -2452,7 +2363,7 @@
       <w:tr>
         <w:tc>
           <w:tcPr>
-            <w:tcW w:type="dxa" w:w="1705"/>
+            <w:tcW w:w="1705" w:type="dxa"/>
           </w:tcPr>
           <w:p>
             <w:r>
@@ -2465,7 +2376,7 @@
         </w:tc>
         <w:tc>
           <w:tcPr>
-            <w:tcW w:type="dxa" w:w="1620"/>
+            <w:tcW w:w="1620" w:type="dxa"/>
           </w:tcPr>
           <w:p>
             <w:r>
@@ -2478,7 +2389,7 @@
         </w:tc>
         <w:tc>
           <w:tcPr>
-            <w:tcW w:type="dxa" w:w="2700"/>
+            <w:tcW w:w="2700" w:type="dxa"/>
           </w:tcPr>
           <w:p>
             <w:r>
@@ -2491,7 +2402,7 @@
         </w:tc>
         <w:tc>
           <w:tcPr>
-            <w:tcW w:type="dxa" w:w="2994"/>
+            <w:tcW w:w="2994" w:type="dxa"/>
           </w:tcPr>
           <w:p>
             <w:r>
@@ -2506,7 +2417,7 @@
       <w:tr>
         <w:tc>
           <w:tcPr>
-            <w:tcW w:type="dxa" w:w="1705"/>
+            <w:tcW w:w="1705" w:type="dxa"/>
           </w:tcPr>
           <w:p>
             <w:r>
@@ -2519,7 +2430,7 @@
         </w:tc>
         <w:tc>
           <w:tcPr>
-            <w:tcW w:type="dxa" w:w="1620"/>
+            <w:tcW w:w="1620" w:type="dxa"/>
           </w:tcPr>
           <w:p>
             <w:r>
@@ -2532,7 +2443,7 @@
         </w:tc>
         <w:tc>
           <w:tcPr>
-            <w:tcW w:type="dxa" w:w="2700"/>
+            <w:tcW w:w="2700" w:type="dxa"/>
           </w:tcPr>
           <w:p>
             <w:r>
@@ -2545,7 +2456,7 @@
         </w:tc>
         <w:tc>
           <w:tcPr>
-            <w:tcW w:type="dxa" w:w="2994"/>
+            <w:tcW w:w="2994" w:type="dxa"/>
           </w:tcPr>
           <w:p>
             <w:r>
@@ -2560,7 +2471,7 @@
       <w:tr>
         <w:tc>
           <w:tcPr>
-            <w:tcW w:type="dxa" w:w="1705"/>
+            <w:tcW w:w="1705" w:type="dxa"/>
           </w:tcPr>
           <w:p>
             <w:r>
@@ -2573,7 +2484,7 @@
         </w:tc>
         <w:tc>
           <w:tcPr>
-            <w:tcW w:type="dxa" w:w="1620"/>
+            <w:tcW w:w="1620" w:type="dxa"/>
           </w:tcPr>
           <w:p>
             <w:r>
@@ -2586,7 +2497,7 @@
         </w:tc>
         <w:tc>
           <w:tcPr>
-            <w:tcW w:type="dxa" w:w="2700"/>
+            <w:tcW w:w="2700" w:type="dxa"/>
           </w:tcPr>
           <w:p>
             <w:r>
@@ -2599,7 +2510,7 @@
         </w:tc>
         <w:tc>
           <w:tcPr>
-            <w:tcW w:type="dxa" w:w="2994"/>
+            <w:tcW w:w="2994" w:type="dxa"/>
           </w:tcPr>
           <w:p>
             <w:r>
@@ -2614,7 +2525,7 @@
       <w:tr>
         <w:tc>
           <w:tcPr>
-            <w:tcW w:type="dxa" w:w="1705"/>
+            <w:tcW w:w="1705" w:type="dxa"/>
           </w:tcPr>
           <w:p>
             <w:r>
@@ -2627,7 +2538,7 @@
         </w:tc>
         <w:tc>
           <w:tcPr>
-            <w:tcW w:type="dxa" w:w="1620"/>
+            <w:tcW w:w="1620" w:type="dxa"/>
           </w:tcPr>
           <w:p>
             <w:r>
@@ -2640,7 +2551,7 @@
         </w:tc>
         <w:tc>
           <w:tcPr>
-            <w:tcW w:type="dxa" w:w="2700"/>
+            <w:tcW w:w="2700" w:type="dxa"/>
           </w:tcPr>
           <w:p>
             <w:r>
@@ -2653,7 +2564,7 @@
         </w:tc>
         <w:tc>
           <w:tcPr>
-            <w:tcW w:type="dxa" w:w="2994"/>
+            <w:tcW w:w="2994" w:type="dxa"/>
           </w:tcPr>
           <w:p>
             <w:r>
@@ -2668,7 +2579,7 @@
       <w:tr>
         <w:tc>
           <w:tcPr>
-            <w:tcW w:type="dxa" w:w="1705"/>
+            <w:tcW w:w="1705" w:type="dxa"/>
           </w:tcPr>
           <w:p>
             <w:r>
@@ -2681,7 +2592,7 @@
         </w:tc>
         <w:tc>
           <w:tcPr>
-            <w:tcW w:type="dxa" w:w="1620"/>
+            <w:tcW w:w="1620" w:type="dxa"/>
           </w:tcPr>
           <w:p>
             <w:r>
@@ -2694,7 +2605,7 @@
         </w:tc>
         <w:tc>
           <w:tcPr>
-            <w:tcW w:type="dxa" w:w="2700"/>
+            <w:tcW w:w="2700" w:type="dxa"/>
           </w:tcPr>
           <w:p>
             <w:r>
@@ -2707,7 +2618,7 @@
         </w:tc>
         <w:tc>
           <w:tcPr>
-            <w:tcW w:type="dxa" w:w="2994"/>
+            <w:tcW w:w="2994" w:type="dxa"/>
           </w:tcPr>
           <w:p>
             <w:r>
@@ -2722,7 +2633,7 @@
       <w:tr>
         <w:tc>
           <w:tcPr>
-            <w:tcW w:type="dxa" w:w="1705"/>
+            <w:tcW w:w="1705" w:type="dxa"/>
           </w:tcPr>
           <w:p>
             <w:r>
@@ -2735,7 +2646,7 @@
         </w:tc>
         <w:tc>
           <w:tcPr>
-            <w:tcW w:type="dxa" w:w="1620"/>
+            <w:tcW w:w="1620" w:type="dxa"/>
           </w:tcPr>
           <w:p>
             <w:r>
@@ -2748,7 +2659,7 @@
         </w:tc>
         <w:tc>
           <w:tcPr>
-            <w:tcW w:type="dxa" w:w="2700"/>
+            <w:tcW w:w="2700" w:type="dxa"/>
           </w:tcPr>
           <w:p>
             <w:r>
@@ -2761,7 +2672,7 @@
         </w:tc>
         <w:tc>
           <w:tcPr>
-            <w:tcW w:type="dxa" w:w="2994"/>
+            <w:tcW w:w="2994" w:type="dxa"/>
           </w:tcPr>
           <w:p>
             <w:r>
@@ -2776,7 +2687,7 @@
       <w:tr>
         <w:tc>
           <w:tcPr>
-            <w:tcW w:type="dxa" w:w="1705"/>
+            <w:tcW w:w="1705" w:type="dxa"/>
           </w:tcPr>
           <w:p>
             <w:r>
@@ -2789,7 +2700,7 @@
         </w:tc>
         <w:tc>
           <w:tcPr>
-            <w:tcW w:type="dxa" w:w="1620"/>
+            <w:tcW w:w="1620" w:type="dxa"/>
           </w:tcPr>
           <w:p>
             <w:r>
@@ -2802,7 +2713,7 @@
         </w:tc>
         <w:tc>
           <w:tcPr>
-            <w:tcW w:type="dxa" w:w="2700"/>
+            <w:tcW w:w="2700" w:type="dxa"/>
           </w:tcPr>
           <w:p>
             <w:r>
@@ -2815,7 +2726,7 @@
         </w:tc>
         <w:tc>
           <w:tcPr>
-            <w:tcW w:type="dxa" w:w="2994"/>
+            <w:tcW w:w="2994" w:type="dxa"/>
           </w:tcPr>
           <w:p>
             <w:r>
@@ -2838,15 +2749,7 @@
         <w:pStyle w:val="ListParagraph"/>
       </w:pPr>
       <w:r>
-        <w:t xml:space="preserve">Submit your SQL INSERT statements for data insertion to the OLTP tables in </w:t>
-      </w:r>
-      <w:proofErr w:type="spellStart"/>
-      <w:r>
-        <w:t>OLTP_insert.sql</w:t>
-      </w:r>
-      <w:proofErr w:type="spellEnd"/>
-      <w:r>
-        <w:t>. If you apply bulk loading, submit each of the cleaned data files used during insertion as well.</w:t>
+        <w:t>Submit your SQL INSERT statements for data insertion to the OLTP tables in OLTP_insert.sql. If you apply bulk loading, submit each of the cleaned data files used during insertion as well.</w:t>
       </w:r>
     </w:p>
     <w:p>
@@ -2869,7 +2772,6 @@
       </w:r>
     </w:p>
     <w:p>
-      <w:pPr/>
       <w:r>
         <w:rPr>
           <w:b/>
@@ -2886,6 +2788,7 @@
         <w:rPr>
           <w:noProof/>
         </w:rPr>
+        <w:lastRenderedPageBreak/>
         <mc:AlternateContent>
           <mc:Choice Requires="wps">
             <w:drawing>
@@ -2998,7 +2901,7 @@
               </wp:anchor>
             </w:drawing>
           </mc:Choice>
-          <mc:Fallback xmlns:w16sdtfl="http://schemas.microsoft.com/office/word/2024/wordml/sdtformatlock" xmlns:w16du="http://schemas.microsoft.com/office/word/2023/wordml/word16du">
+          <mc:Fallback>
             <w:pict>
               <v:shape w14:anchorId="0AD4021C" id="_x0000_s1030" type="#_x0000_t202" style="position:absolute;left:0;text-align:left;margin-left:37.8pt;margin-top:20.2pt;width:432.6pt;height:424.8pt;z-index:251660292;visibility:visible;mso-wrap-style:square;mso-width-percent:0;mso-height-percent:0;mso-wrap-distance-left:9pt;mso-wrap-distance-top:3.6pt;mso-wrap-distance-right:9pt;mso-wrap-distance-bottom:3.6pt;mso-position-horizontal:absolute;mso-position-horizontal-relative:text;mso-position-vertical:absolute;mso-position-vertical-relative:text;mso-width-percent:0;mso-height-percent:0;mso-width-relative:margin;mso-height-relative:margin;v-text-anchor:top" o:gfxdata="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">
                 <v:textbox>
@@ -3168,7 +3071,7 @@
               </wp:anchor>
             </w:drawing>
           </mc:Choice>
-          <mc:Fallback xmlns:w16sdtfl="http://schemas.microsoft.com/office/word/2024/wordml/sdtformatlock" xmlns:w16du="http://schemas.microsoft.com/office/word/2023/wordml/word16du">
+          <mc:Fallback>
             <w:pict>
               <v:shape w14:anchorId="4A51F466" id="_x0000_s1031" type="#_x0000_t202" style="position:absolute;left:0;text-align:left;margin-left:39.6pt;margin-top:44.4pt;width:441pt;height:636pt;z-index:251678724;visibility:visible;mso-wrap-style:square;mso-width-percent:0;mso-height-percent:0;mso-wrap-distance-left:9pt;mso-wrap-distance-top:3.6pt;mso-wrap-distance-right:9pt;mso-wrap-distance-bottom:3.6pt;mso-position-horizontal:absolute;mso-position-horizontal-relative:text;mso-position-vertical:absolute;mso-position-vertical-relative:text;mso-width-percent:0;mso-height-percent:0;mso-width-relative:margin;mso-height-relative:margin;v-text-anchor:top" o:gfxdata="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">
                 <v:textbox>
@@ -3216,24 +3119,28 @@
       </w:r>
     </w:p>
     <w:p>
-      <w:pPr/>
       <w:r>
+        <w:rPr>
+          <w:noProof/>
+        </w:rPr>
+        <w:lastRenderedPageBreak/>
         <w:drawing>
-          <wp:inline xmlns:a="http://schemas.openxmlformats.org/drawingml/2006/main" xmlns:pic="http://schemas.openxmlformats.org/drawingml/2006/picture">
+          <wp:inline distT="0" distB="0" distL="0" distR="0" wp14:anchorId="41FA5CCD" wp14:editId="3CC6EC54">
             <wp:extent cx="5943600" cy="4157628"/>
+            <wp:effectExtent l="0" t="0" r="0" b="0"/>
             <wp:docPr id="1960066386" name="Picture 1960066386"/>
             <wp:cNvGraphicFramePr>
-              <a:graphicFrameLocks noChangeAspect="1"/>
+              <a:graphicFrameLocks xmlns:a="http://schemas.openxmlformats.org/drawingml/2006/main" noChangeAspect="1"/>
             </wp:cNvGraphicFramePr>
-            <a:graphic>
+            <a:graphic xmlns:a="http://schemas.openxmlformats.org/drawingml/2006/main">
               <a:graphicData uri="http://schemas.openxmlformats.org/drawingml/2006/picture">
-                <pic:pic>
+                <pic:pic xmlns:pic="http://schemas.openxmlformats.org/drawingml/2006/picture">
                   <pic:nvPicPr>
                     <pic:cNvPr id="0" name="dw_erd.png"/>
                     <pic:cNvPicPr/>
                   </pic:nvPicPr>
                   <pic:blipFill>
-                    <a:blip r:embed="rId17"/>
+                    <a:blip r:embed="rId11"/>
                     <a:stretch>
                       <a:fillRect/>
                     </a:stretch>
@@ -3243,7 +3150,9 @@
                       <a:off x="0" y="0"/>
                       <a:ext cx="5943600" cy="4157628"/>
                     </a:xfrm>
-                    <a:prstGeom prst="rect"/>
+                    <a:prstGeom prst="rect">
+                      <a:avLst/>
+                    </a:prstGeom>
                   </pic:spPr>
                 </pic:pic>
               </a:graphicData>
@@ -3253,10 +3162,8 @@
       </w:r>
     </w:p>
     <w:p>
-      <w:pPr/>
       <w:r>
         <w:rPr>
-          <w:b w:val="0"/>
           <w:sz w:val="20"/>
         </w:rPr>
         <w:t>Design explanation: We adopted a STAR SCHEMA with one fact table, FactLoan, whose grain is one completed loan transaction (a book borrowed and returned), matching the brief's primary analytical focus on loan duration and borrowing activity. Four dimensions surround it: DimMember, DimStaff, DimBook and DimDate. Every table, including the fact and time dimension, uses an AUTO_INCREMENT surrogate key. Membership-tier attributes (TierName, TierLevel, BorrowLimit) are denormalised into DimMember, and the minimum-tier requirement into DimBook, so no snowflaked outrigger tables are needed - this keeps queries to single joins and suits the read-oriented workload. DimDate is kept at DAY granularity as instructed (date, day of week, weekend flag, month, quarter, year) and is role-played twice by the fact table, as borrow date and return date. CopySeqNo is carried as a degenerate dimension for traceability to the physical copy. Pre-computed measures: LoanDurationDays (return - borrow), DaysBeforeDue (due - return; negative means late) and an IsLate flag, so common analyses need no date arithmetic at query time. Assumptions: only completed loans are loaded (the single open loan is excluded from the fact table); slowly changing dimensions are out of scope per the brief - if tier changes had to be tracked, DimMember could be extended to SCD Type 2 with effective-date columns.</w:t>
@@ -3277,29 +3184,13 @@
       </w:pPr>
       <w:r>
         <w:lastRenderedPageBreak/>
-        <w:t xml:space="preserve">Submit your CREATE table statements for DW table creations in </w:t>
-      </w:r>
-      <w:proofErr w:type="spellStart"/>
-      <w:r>
-        <w:t>DW_create.sql</w:t>
-      </w:r>
-      <w:proofErr w:type="spellEnd"/>
-      <w:r>
-        <w:t xml:space="preserve">. Use appropriate SQL statements to extract and load data from OLTP tables to the </w:t>
+        <w:t xml:space="preserve">Submit your CREATE table statements for DW table creations in DW_create.sql. Use appropriate SQL statements to extract and load data from OLTP tables to the </w:t>
       </w:r>
       <w:r>
         <w:t>DW and</w:t>
       </w:r>
       <w:r>
-        <w:t xml:space="preserve"> submit all your queries in </w:t>
-      </w:r>
-      <w:proofErr w:type="spellStart"/>
-      <w:r>
-        <w:t>DW_insert.sql</w:t>
-      </w:r>
-      <w:proofErr w:type="spellEnd"/>
-      <w:r>
-        <w:t>.</w:t>
+        <w:t xml:space="preserve"> submit all your queries in DW_insert.sql.</w:t>
       </w:r>
     </w:p>
     <w:bookmarkEnd w:id="1"/>
@@ -3337,7 +3228,6 @@
       </w:r>
     </w:p>
     <w:p>
-      <w:pPr/>
       <w:r>
         <w:rPr>
           <w:b/>
@@ -3347,10 +3237,8 @@
       </w:r>
     </w:p>
     <w:p>
-      <w:pPr/>
       <w:r>
         <w:rPr>
-          <w:b w:val="0"/>
           <w:sz w:val="20"/>
         </w:rPr>
         <w:t>ETL verification: (1) Row-count reconciliation - completed loans in OLTP (SELECT COUNT(*) FROM Loan WHERE ReturnDatetime IS NOT NULL) = 12,343 and FactLoan = 12,343; DimMember = Member = 301; DimBook = Book = 500; DimStaff = Staff = 51. (2) Measure reconciliation - SUM(DATEDIFF(ReturnDatetime, StartDatetime)) computed directly on the OLTP Loan table = 108,801 days, identical to SUM(LoanDurationDays) in FactLoan, proving the duration measure was derived correctly for every row. (3) Referential integrity - a LEFT JOIN from FactLoan to each dimension returns 0 orphan rows, and all foreign keys are enforced by constraints so no fact row can reference a missing dimension member. The verification queries are included at the bottom of DW_insert.sql.</w:t>
@@ -3425,7 +3313,7 @@
               </wp:anchor>
             </w:drawing>
           </mc:Choice>
-          <mc:Fallback xmlns:w16sdtfl="http://schemas.microsoft.com/office/word/2024/wordml/sdtformatlock" xmlns:w16du="http://schemas.microsoft.com/office/word/2023/wordml/word16du">
+          <mc:Fallback>
             <w:pict>
               <v:shape w14:anchorId="30DA386E" id="_x0000_s1032" type="#_x0000_t202" style="position:absolute;margin-left:34.2pt;margin-top:14.25pt;width:445.2pt;height:463.8pt;z-index:251676676;visibility:visible;mso-wrap-style:square;mso-width-percent:0;mso-height-percent:0;mso-wrap-distance-left:9pt;mso-wrap-distance-top:3.6pt;mso-wrap-distance-right:9pt;mso-wrap-distance-bottom:3.6pt;mso-position-horizontal:absolute;mso-position-horizontal-relative:text;mso-position-vertical:absolute;mso-position-vertical-relative:text;mso-width-percent:0;mso-height-percent:0;mso-width-relative:margin;mso-height-relative:margin;v-text-anchor:top" o:gfxdata="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">
                 <v:textbox>
@@ -3481,15 +3369,7 @@
         <w:t xml:space="preserve"> if group size is 4.</w:t>
       </w:r>
       <w:r>
-        <w:t xml:space="preserve"> Separately submit all your queries in </w:t>
-      </w:r>
-      <w:proofErr w:type="spellStart"/>
-      <w:r>
-        <w:t>DW_query.sql</w:t>
-      </w:r>
-      <w:proofErr w:type="spellEnd"/>
-      <w:r>
-        <w:t xml:space="preserve">. (So do not include </w:t>
+        <w:t xml:space="preserve"> Separately submit all your queries in DW_query.sql. (So do not include </w:t>
       </w:r>
       <w:r>
         <w:t>your</w:t>
@@ -3507,10 +3387,8 @@
       </w:r>
     </w:p>
     <w:p>
-      <w:pPr/>
       <w:r>
         <w:rPr>
-          <w:b w:val="0"/>
           <w:sz w:val="20"/>
         </w:rPr>
         <w:t>Objective: identify long-term and seasonal trends in loan volume by month and year (time dimension). Results: monthly completed loans grew from ~35/month in 2020 to 2,838 in December 2025, with a clear year-end surge every year (Dec 2022: 90 vs Nov 57; Dec 2024: 235 vs Nov 177; Dec 2025: 2,838 vs Nov 1,188). Average loan duration stays stable at 8-9.5 days throughout. Insight: borrowing activity is growing rapidly (roughly doubling year on year since 2023) and peaks sharply in November-December. Staffing and stock planning should anticipate the December peak; the stable duration shows the 14-day policy comfortably covers actual reading time.</w:t>
@@ -3533,10 +3411,8 @@
       </w:r>
     </w:p>
     <w:p>
-      <w:pPr/>
       <w:r>
         <w:rPr>
-          <w:b w:val="0"/>
           <w:sz w:val="20"/>
         </w:rPr>
         <w:t>Objective: find the borrowing pattern across days of the week to support staffing decisions (time dimension). Results: Sunday (35.9%) and Saturday (33.9%) together account for 69.8% of all loans; each weekday contributes only 5-7% (Friday lowest at 5.3%). Insight: demand is overwhelmingly a weekend phenomenon. Counter staffing and shelving operations should be concentrated on weekends, while system maintenance and stock-taking are best scheduled on Fridays.</w:t>
@@ -3556,10 +3432,8 @@
       </w:r>
     </w:p>
     <w:p>
-      <w:pPr/>
       <w:r>
         <w:rPr>
-          <w:b w:val="0"/>
           <w:sz w:val="20"/>
         </w:rPr>
         <w:t>Objective: compare genre popularity in absolute loans and loans per title, plus reading pace (book dimension). Results: Research Journal has the most total loans (2,093) but only 21.8 loans per title, while Young Adult has the highest intensity (31.2 loans per title from just 39 titles); Children is high on both (1,873 loans, 28.0 per title). Average duration is similar across genres (8.4-9.3 days). Insight: Research Journal's volume comes from its large catalogue (96 titles), whereas Young Adult and Children titles are individually in much higher demand - these genres are the best candidates for additional copies.</w:t>
@@ -3579,10 +3453,8 @@
       </w:r>
     </w:p>
     <w:p>
-      <w:pPr/>
       <w:r>
         <w:rPr>
-          <w:b w:val="0"/>
           <w:sz w:val="20"/>
         </w:rPr>
         <w:t>Objective: detect outstanding members with significantly higher/lower activity (member dimension; loan count and total duration measures). Results: the top borrower, Evan Seah (Premium), completed 454 loans; Isaac Wilson (Premium) holds books longest in aggregate (5,726 days over 409 loans). Two of the top five are only Basic tier (Jasper Johnson 331, Theodore Campbell 324 loans). The least active members completed only 9-11 loans. Insight: activity varies by a factor of ~50 between the most and least active members. The heavy Basic-tier borrowers are prime candidates for tier upgrades, and the low-activity group could be targeted with re-engagement campaigns.</w:t>
@@ -3602,10 +3474,8 @@
       </w:r>
     </w:p>
     <w:p>
-      <w:pPr/>
       <w:r>
         <w:rPr>
-          <w:b w:val="0"/>
           <w:sz w:val="20"/>
         </w:rPr>
         <w:t>Objective: examine whether membership tier relates to return discipline (member dimension x lateness measures). Results: late-return rate falls as tier rises - Basic 8.94%, Advanced 8.12%, Premium 7.94% - while average loan duration rises with tier (8.54 to 9.39 days). Insight: higher-tier members keep books slightly longer but return them more punctually, so the higher borrow limits given to upper tiers are not causing overdue problems. Late-return interventions (reminders, penalties) would be most effective aimed at Basic members.</w:t>
@@ -3625,10 +3495,8 @@
       </w:r>
     </w:p>
     <w:p>
-      <w:pPr/>
       <w:r>
         <w:rPr>
-          <w:b w:val="0"/>
           <w:sz w:val="20"/>
         </w:rPr>
         <w:t>Objective: multi-dimensional analysis (genre x month) - do Children and Young Adult loans spike in school-holiday months? Results: Children loans climb from 65 in January to 486 in December (7.5x), with secondary highs in June-July (126/131); Young Adult mirrors this (51 in January to 301 in December). Insight: youth borrowing is strongly seasonal and concentrated in the November-December school holidays, compounding the overall year-end surge from Analysis 1. The library should time children's programmes, new acquisitions and extra copies of popular youth titles for Q4.</w:t>
@@ -3645,10 +3513,10 @@
       </w:pPr>
     </w:p>
     <w:sectPr>
-      <w:headerReference w:type="even" r:id="rId11"/>
-      <w:headerReference w:type="default" r:id="rId12"/>
-      <w:footerReference w:type="default" r:id="rId13"/>
-      <w:headerReference w:type="first" r:id="rId14"/>
+      <w:headerReference w:type="even" r:id="rId12"/>
+      <w:headerReference w:type="default" r:id="rId13"/>
+      <w:footerReference w:type="default" r:id="rId14"/>
+      <w:headerReference w:type="first" r:id="rId15"/>
       <w:pgSz w:w="11909" w:h="16834" w:code="9"/>
       <w:pgMar w:top="1440" w:right="1080" w:bottom="1440" w:left="1080" w:header="720" w:footer="720" w:gutter="0"/>
       <w:pgNumType w:start="0"/>
@@ -3661,7 +3529,7 @@
 </file>
 
 <file path=word/endnotes.xml><?xml version="1.0" encoding="utf-8"?>
-<w:endnotes xmlns:wpc="http://schemas.microsoft.com/office/word/2010/wordprocessingCanvas" xmlns:cx="http://schemas.microsoft.com/office/drawing/2014/chartex" xmlns:cx1="http://schemas.microsoft.com/office/drawing/2015/9/8/chartex" xmlns:cx2="http://schemas.microsoft.com/office/drawing/2015/10/21/chartex" xmlns:cx3="http://schemas.microsoft.com/office/drawing/2016/5/9/chartex" xmlns:cx4="http://schemas.microsoft.com/office/drawing/2016/5/10/chartex" xmlns:cx5="http://schemas.microsoft.com/office/drawing/2016/5/11/chartex" xmlns:cx6="http://schemas.microsoft.com/office/drawing/2016/5/12/chartex" xmlns:cx7="http://schemas.microsoft.com/office/drawing/2016/5/13/chartex" xmlns:cx8="http://schemas.microsoft.com/office/drawing/2016/5/14/chartex" xmlns:mc="http://schemas.openxmlformats.org/markup-compatibility/2006" xmlns:aink="http://schemas.microsoft.com/office/drawing/2016/ink" xmlns:am3d="http://schemas.microsoft.com/office/drawing/2017/model3d" xmlns:o="urn:schemas-microsoft-com:office:office" xmlns:oel="http://schemas.microsoft.com/office/2019/extlst" xmlns:r="http://schemas.openxmlformats.org/officeDocument/2006/relationships" xmlns:m="http://schemas.openxmlformats.org/officeDocument/2006/math" xmlns:v="urn:schemas-microsoft-com:vml" xmlns:wp14="http://schemas.microsoft.com/office/word/2010/wordprocessingDrawing" xmlns:wp="http://schemas.openxmlformats.org/drawingml/2006/wordprocessingDrawing" xmlns:w10="urn:schemas-microsoft-com:office:word" xmlns:w="http://schemas.openxmlformats.org/wordprocessingml/2006/main" xmlns:w14="http://schemas.microsoft.com/office/word/2010/wordml" xmlns:w15="http://schemas.microsoft.com/office/word/2012/wordml" xmlns:w16cex="http://schemas.microsoft.com/office/word/2018/wordml/cex" xmlns:w16cid="http://schemas.microsoft.com/office/word/2016/wordml/cid" xmlns:w16="http://schemas.microsoft.com/office/word/2018/wordml" xmlns:w16sdtdh="http://schemas.microsoft.com/office/word/2020/wordml/sdtdatahash" xmlns:w16se="http://schemas.microsoft.com/office/word/2015/wordml/symex" xmlns:wpg="http://schemas.microsoft.com/office/word/2010/wordprocessingGroup" xmlns:wpi="http://schemas.microsoft.com/office/word/2010/wordprocessingInk" xmlns:wne="http://schemas.microsoft.com/office/word/2006/wordml" xmlns:wps="http://schemas.microsoft.com/office/word/2010/wordprocessingShape" mc:Ignorable="w14 w15 w16se w16cid w16 w16cex w16sdtdh wp14">
+<w:endnotes xmlns:wpc="http://schemas.microsoft.com/office/word/2010/wordprocessingCanvas" xmlns:cx="http://schemas.microsoft.com/office/drawing/2014/chartex" xmlns:cx1="http://schemas.microsoft.com/office/drawing/2015/9/8/chartex" xmlns:cx2="http://schemas.microsoft.com/office/drawing/2015/10/21/chartex" xmlns:cx3="http://schemas.microsoft.com/office/drawing/2016/5/9/chartex" xmlns:cx4="http://schemas.microsoft.com/office/drawing/2016/5/10/chartex" xmlns:cx5="http://schemas.microsoft.com/office/drawing/2016/5/11/chartex" xmlns:cx6="http://schemas.microsoft.com/office/drawing/2016/5/12/chartex" xmlns:cx7="http://schemas.microsoft.com/office/drawing/2016/5/13/chartex" xmlns:cx8="http://schemas.microsoft.com/office/drawing/2016/5/14/chartex" xmlns:mc="http://schemas.openxmlformats.org/markup-compatibility/2006" xmlns:aink="http://schemas.microsoft.com/office/drawing/2016/ink" xmlns:am3d="http://schemas.microsoft.com/office/drawing/2017/model3d" xmlns:o="urn:schemas-microsoft-com:office:office" xmlns:oel="http://schemas.microsoft.com/office/2019/extlst" xmlns:r="http://schemas.openxmlformats.org/officeDocument/2006/relationships" xmlns:m="http://schemas.openxmlformats.org/officeDocument/2006/math" xmlns:v="urn:schemas-microsoft-com:vml" xmlns:wp14="http://schemas.microsoft.com/office/word/2010/wordprocessingDrawing" xmlns:wp="http://schemas.openxmlformats.org/drawingml/2006/wordprocessingDrawing" xmlns:w10="urn:schemas-microsoft-com:office:word" xmlns:w="http://schemas.openxmlformats.org/wordprocessingml/2006/main" xmlns:w14="http://schemas.microsoft.com/office/word/2010/wordml" xmlns:w15="http://schemas.microsoft.com/office/word/2012/wordml" xmlns:w16cex="http://schemas.microsoft.com/office/word/2018/wordml/cex" xmlns:w16cid="http://schemas.microsoft.com/office/word/2016/wordml/cid" xmlns:w16="http://schemas.microsoft.com/office/word/2018/wordml" xmlns:w16du="http://schemas.microsoft.com/office/word/2023/wordml/word16du" xmlns:w16sdtdh="http://schemas.microsoft.com/office/word/2020/wordml/sdtdatahash" xmlns:w16sdtfl="http://schemas.microsoft.com/office/word/2024/wordml/sdtformatlock" xmlns:w16se="http://schemas.microsoft.com/office/word/2015/wordml/symex" xmlns:wpg="http://schemas.microsoft.com/office/word/2010/wordprocessingGroup" xmlns:wpi="http://schemas.microsoft.com/office/word/2010/wordprocessingInk" xmlns:wne="http://schemas.microsoft.com/office/word/2006/wordml" xmlns:wps="http://schemas.microsoft.com/office/word/2010/wordprocessingShape" mc:Ignorable="w14 w15 w16se w16cid w16 w16cex w16sdtdh w16sdtfl w16du wp14">
   <w:endnote w:type="separator" w:id="-1">
     <w:p>
       <w:r>
@@ -3683,7 +3551,7 @@
 </file>
 
 <file path=word/footer1.xml><?xml version="1.0" encoding="utf-8"?>
-<w:ftr xmlns:wpc="http://schemas.microsoft.com/office/word/2010/wordprocessingCanvas" xmlns:cx="http://schemas.microsoft.com/office/drawing/2014/chartex" xmlns:cx1="http://schemas.microsoft.com/office/drawing/2015/9/8/chartex" xmlns:cx2="http://schemas.microsoft.com/office/drawing/2015/10/21/chartex" xmlns:cx3="http://schemas.microsoft.com/office/drawing/2016/5/9/chartex" xmlns:cx4="http://schemas.microsoft.com/office/drawing/2016/5/10/chartex" xmlns:cx5="http://schemas.microsoft.com/office/drawing/2016/5/11/chartex" xmlns:cx6="http://schemas.microsoft.com/office/drawing/2016/5/12/chartex" xmlns:cx7="http://schemas.microsoft.com/office/drawing/2016/5/13/chartex" xmlns:cx8="http://schemas.microsoft.com/office/drawing/2016/5/14/chartex" xmlns:mc="http://schemas.openxmlformats.org/markup-compatibility/2006" xmlns:aink="http://schemas.microsoft.com/office/drawing/2016/ink" xmlns:am3d="http://schemas.microsoft.com/office/drawing/2017/model3d" xmlns:o="urn:schemas-microsoft-com:office:office" xmlns:oel="http://schemas.microsoft.com/office/2019/extlst" xmlns:r="http://schemas.openxmlformats.org/officeDocument/2006/relationships" xmlns:m="http://schemas.openxmlformats.org/officeDocument/2006/math" xmlns:v="urn:schemas-microsoft-com:vml" xmlns:wp14="http://schemas.microsoft.com/office/word/2010/wordprocessingDrawing" xmlns:wp="http://schemas.openxmlformats.org/drawingml/2006/wordprocessingDrawing" xmlns:w10="urn:schemas-microsoft-com:office:word" xmlns:w="http://schemas.openxmlformats.org/wordprocessingml/2006/main" xmlns:w14="http://schemas.microsoft.com/office/word/2010/wordml" xmlns:w15="http://schemas.microsoft.com/office/word/2012/wordml" xmlns:w16cex="http://schemas.microsoft.com/office/word/2018/wordml/cex" xmlns:w16cid="http://schemas.microsoft.com/office/word/2016/wordml/cid" xmlns:w16="http://schemas.microsoft.com/office/word/2018/wordml" xmlns:w16sdtdh="http://schemas.microsoft.com/office/word/2020/wordml/sdtdatahash" xmlns:w16se="http://schemas.microsoft.com/office/word/2015/wordml/symex" xmlns:wpg="http://schemas.microsoft.com/office/word/2010/wordprocessingGroup" xmlns:wpi="http://schemas.microsoft.com/office/word/2010/wordprocessingInk" xmlns:wne="http://schemas.microsoft.com/office/word/2006/wordml" xmlns:wps="http://schemas.microsoft.com/office/word/2010/wordprocessingShape" mc:Ignorable="w14 w15 w16se w16cid w16 w16cex w16sdtdh wp14">
+<w:ftr xmlns:wpc="http://schemas.microsoft.com/office/word/2010/wordprocessingCanvas" xmlns:cx="http://schemas.microsoft.com/office/drawing/2014/chartex" xmlns:cx1="http://schemas.microsoft.com/office/drawing/2015/9/8/chartex" xmlns:cx2="http://schemas.microsoft.com/office/drawing/2015/10/21/chartex" xmlns:cx3="http://schemas.microsoft.com/office/drawing/2016/5/9/chartex" xmlns:cx4="http://schemas.microsoft.com/office/drawing/2016/5/10/chartex" xmlns:cx5="http://schemas.microsoft.com/office/drawing/2016/5/11/chartex" xmlns:cx6="http://schemas.microsoft.com/office/drawing/2016/5/12/chartex" xmlns:cx7="http://schemas.microsoft.com/office/drawing/2016/5/13/chartex" xmlns:cx8="http://schemas.microsoft.com/office/drawing/2016/5/14/chartex" xmlns:mc="http://schemas.openxmlformats.org/markup-compatibility/2006" xmlns:aink="http://schemas.microsoft.com/office/drawing/2016/ink" xmlns:am3d="http://schemas.microsoft.com/office/drawing/2017/model3d" xmlns:o="urn:schemas-microsoft-com:office:office" xmlns:oel="http://schemas.microsoft.com/office/2019/extlst" xmlns:r="http://schemas.openxmlformats.org/officeDocument/2006/relationships" xmlns:m="http://schemas.openxmlformats.org/officeDocument/2006/math" xmlns:v="urn:schemas-microsoft-com:vml" xmlns:wp14="http://schemas.microsoft.com/office/word/2010/wordprocessingDrawing" xmlns:wp="http://schemas.openxmlformats.org/drawingml/2006/wordprocessingDrawing" xmlns:w10="urn:schemas-microsoft-com:office:word" xmlns:w="http://schemas.openxmlformats.org/wordprocessingml/2006/main" xmlns:w14="http://schemas.microsoft.com/office/word/2010/wordml" xmlns:w15="http://schemas.microsoft.com/office/word/2012/wordml" xmlns:w16cex="http://schemas.microsoft.com/office/word/2018/wordml/cex" xmlns:w16cid="http://schemas.microsoft.com/office/word/2016/wordml/cid" xmlns:w16="http://schemas.microsoft.com/office/word/2018/wordml" xmlns:w16du="http://schemas.microsoft.com/office/word/2023/wordml/word16du" xmlns:w16sdtdh="http://schemas.microsoft.com/office/word/2020/wordml/sdtdatahash" xmlns:w16sdtfl="http://schemas.microsoft.com/office/word/2024/wordml/sdtformatlock" xmlns:w16se="http://schemas.microsoft.com/office/word/2015/wordml/symex" xmlns:wpg="http://schemas.microsoft.com/office/word/2010/wordprocessingGroup" xmlns:wpi="http://schemas.microsoft.com/office/word/2010/wordprocessingInk" xmlns:wne="http://schemas.microsoft.com/office/word/2006/wordml" xmlns:wps="http://schemas.microsoft.com/office/word/2010/wordprocessingShape" mc:Ignorable="w14 w15 w16se w16cid w16 w16cex w16sdtdh w16sdtfl w16du wp14">
   <w:sdt>
     <w:sdtPr>
       <w:id w:val="1375117340"/>
@@ -3725,7 +3593,7 @@
 </file>
 
 <file path=word/footnotes.xml><?xml version="1.0" encoding="utf-8"?>
-<w:footnotes xmlns:wpc="http://schemas.microsoft.com/office/word/2010/wordprocessingCanvas" xmlns:cx="http://schemas.microsoft.com/office/drawing/2014/chartex" xmlns:cx1="http://schemas.microsoft.com/office/drawing/2015/9/8/chartex" xmlns:cx2="http://schemas.microsoft.com/office/drawing/2015/10/21/chartex" xmlns:cx3="http://schemas.microsoft.com/office/drawing/2016/5/9/chartex" xmlns:cx4="http://schemas.microsoft.com/office/drawing/2016/5/10/chartex" xmlns:cx5="http://schemas.microsoft.com/office/drawing/2016/5/11/chartex" xmlns:cx6="http://schemas.microsoft.com/office/drawing/2016/5/12/chartex" xmlns:cx7="http://schemas.microsoft.com/office/drawing/2016/5/13/chartex" xmlns:cx8="http://schemas.microsoft.com/office/drawing/2016/5/14/chartex" xmlns:mc="http://schemas.openxmlformats.org/markup-compatibility/2006" xmlns:aink="http://schemas.microsoft.com/office/drawing/2016/ink" xmlns:am3d="http://schemas.microsoft.com/office/drawing/2017/model3d" xmlns:o="urn:schemas-microsoft-com:office:office" xmlns:oel="http://schemas.microsoft.com/office/2019/extlst" xmlns:r="http://schemas.openxmlformats.org/officeDocument/2006/relationships" xmlns:m="http://schemas.openxmlformats.org/officeDocument/2006/math" xmlns:v="urn:schemas-microsoft-com:vml" xmlns:wp14="http://schemas.microsoft.com/office/word/2010/wordprocessingDrawing" xmlns:wp="http://schemas.openxmlformats.org/drawingml/2006/wordprocessingDrawing" xmlns:w10="urn:schemas-microsoft-com:office:word" xmlns:w="http://schemas.openxmlformats.org/wordprocessingml/2006/main" xmlns:w14="http://schemas.microsoft.com/office/word/2010/wordml" xmlns:w15="http://schemas.microsoft.com/office/word/2012/wordml" xmlns:w16cex="http://schemas.microsoft.com/office/word/2018/wordml/cex" xmlns:w16cid="http://schemas.microsoft.com/office/word/2016/wordml/cid" xmlns:w16="http://schemas.microsoft.com/office/word/2018/wordml" xmlns:w16sdtdh="http://schemas.microsoft.com/office/word/2020/wordml/sdtdatahash" xmlns:w16se="http://schemas.microsoft.com/office/word/2015/wordml/symex" xmlns:wpg="http://schemas.microsoft.com/office/word/2010/wordprocessingGroup" xmlns:wpi="http://schemas.microsoft.com/office/word/2010/wordprocessingInk" xmlns:wne="http://schemas.microsoft.com/office/word/2006/wordml" xmlns:wps="http://schemas.microsoft.com/office/word/2010/wordprocessingShape" mc:Ignorable="w14 w15 w16se w16cid w16 w16cex w16sdtdh wp14">
+<w:footnotes xmlns:wpc="http://schemas.microsoft.com/office/word/2010/wordprocessingCanvas" xmlns:cx="http://schemas.microsoft.com/office/drawing/2014/chartex" xmlns:cx1="http://schemas.microsoft.com/office/drawing/2015/9/8/chartex" xmlns:cx2="http://schemas.microsoft.com/office/drawing/2015/10/21/chartex" xmlns:cx3="http://schemas.microsoft.com/office/drawing/2016/5/9/chartex" xmlns:cx4="http://schemas.microsoft.com/office/drawing/2016/5/10/chartex" xmlns:cx5="http://schemas.microsoft.com/office/drawing/2016/5/11/chartex" xmlns:cx6="http://schemas.microsoft.com/office/drawing/2016/5/12/chartex" xmlns:cx7="http://schemas.microsoft.com/office/drawing/2016/5/13/chartex" xmlns:cx8="http://schemas.microsoft.com/office/drawing/2016/5/14/chartex" xmlns:mc="http://schemas.openxmlformats.org/markup-compatibility/2006" xmlns:aink="http://schemas.microsoft.com/office/drawing/2016/ink" xmlns:am3d="http://schemas.microsoft.com/office/drawing/2017/model3d" xmlns:o="urn:schemas-microsoft-com:office:office" xmlns:oel="http://schemas.microsoft.com/office/2019/extlst" xmlns:r="http://schemas.openxmlformats.org/officeDocument/2006/relationships" xmlns:m="http://schemas.openxmlformats.org/officeDocument/2006/math" xmlns:v="urn:schemas-microsoft-com:vml" xmlns:wp14="http://schemas.microsoft.com/office/word/2010/wordprocessingDrawing" xmlns:wp="http://schemas.openxmlformats.org/drawingml/2006/wordprocessingDrawing" xmlns:w10="urn:schemas-microsoft-com:office:word" xmlns:w="http://schemas.openxmlformats.org/wordprocessingml/2006/main" xmlns:w14="http://schemas.microsoft.com/office/word/2010/wordml" xmlns:w15="http://schemas.microsoft.com/office/word/2012/wordml" xmlns:w16cex="http://schemas.microsoft.com/office/word/2018/wordml/cex" xmlns:w16cid="http://schemas.microsoft.com/office/word/2016/wordml/cid" xmlns:w16="http://schemas.microsoft.com/office/word/2018/wordml" xmlns:w16du="http://schemas.microsoft.com/office/word/2023/wordml/word16du" xmlns:w16sdtdh="http://schemas.microsoft.com/office/word/2020/wordml/sdtdatahash" xmlns:w16sdtfl="http://schemas.microsoft.com/office/word/2024/wordml/sdtformatlock" xmlns:w16se="http://schemas.microsoft.com/office/word/2015/wordml/symex" xmlns:wpg="http://schemas.microsoft.com/office/word/2010/wordprocessingGroup" xmlns:wpi="http://schemas.microsoft.com/office/word/2010/wordprocessingInk" xmlns:wne="http://schemas.microsoft.com/office/word/2006/wordml" xmlns:wps="http://schemas.microsoft.com/office/word/2010/wordprocessingShape" mc:Ignorable="w14 w15 w16se w16cid w16 w16cex w16sdtdh w16sdtfl w16du wp14">
   <w:footnote w:type="separator" w:id="-1">
     <w:p>
       <w:r>
@@ -3747,7 +3615,7 @@
 </file>
 
 <file path=word/header1.xml><?xml version="1.0" encoding="utf-8"?>
-<w:hdr xmlns:wpc="http://schemas.microsoft.com/office/word/2010/wordprocessingCanvas" xmlns:cx="http://schemas.microsoft.com/office/drawing/2014/chartex" xmlns:cx1="http://schemas.microsoft.com/office/drawing/2015/9/8/chartex" xmlns:cx2="http://schemas.microsoft.com/office/drawing/2015/10/21/chartex" xmlns:cx3="http://schemas.microsoft.com/office/drawing/2016/5/9/chartex" xmlns:cx4="http://schemas.microsoft.com/office/drawing/2016/5/10/chartex" xmlns:cx5="http://schemas.microsoft.com/office/drawing/2016/5/11/chartex" xmlns:cx6="http://schemas.microsoft.com/office/drawing/2016/5/12/chartex" xmlns:cx7="http://schemas.microsoft.com/office/drawing/2016/5/13/chartex" xmlns:cx8="http://schemas.microsoft.com/office/drawing/2016/5/14/chartex" xmlns:mc="http://schemas.openxmlformats.org/markup-compatibility/2006" xmlns:aink="http://schemas.microsoft.com/office/drawing/2016/ink" xmlns:am3d="http://schemas.microsoft.com/office/drawing/2017/model3d" xmlns:o="urn:schemas-microsoft-com:office:office" xmlns:oel="http://schemas.microsoft.com/office/2019/extlst" xmlns:r="http://schemas.openxmlformats.org/officeDocument/2006/relationships" xmlns:m="http://schemas.openxmlformats.org/officeDocument/2006/math" xmlns:v="urn:schemas-microsoft-com:vml" xmlns:wp14="http://schemas.microsoft.com/office/word/2010/wordprocessingDrawing" xmlns:wp="http://schemas.openxmlformats.org/drawingml/2006/wordprocessingDrawing" xmlns:w10="urn:schemas-microsoft-com:office:word" xmlns:w="http://schemas.openxmlformats.org/wordprocessingml/2006/main" xmlns:w14="http://schemas.microsoft.com/office/word/2010/wordml" xmlns:w15="http://schemas.microsoft.com/office/word/2012/wordml" xmlns:w16cex="http://schemas.microsoft.com/office/word/2018/wordml/cex" xmlns:w16cid="http://schemas.microsoft.com/office/word/2016/wordml/cid" xmlns:w16="http://schemas.microsoft.com/office/word/2018/wordml" xmlns:w16sdtdh="http://schemas.microsoft.com/office/word/2020/wordml/sdtdatahash" xmlns:w16se="http://schemas.microsoft.com/office/word/2015/wordml/symex" xmlns:wpg="http://schemas.microsoft.com/office/word/2010/wordprocessingGroup" xmlns:wpi="http://schemas.microsoft.com/office/word/2010/wordprocessingInk" xmlns:wne="http://schemas.microsoft.com/office/word/2006/wordml" xmlns:wps="http://schemas.microsoft.com/office/word/2010/wordprocessingShape" mc:Ignorable="w14 w15 w16se w16cid w16 w16cex w16sdtdh wp14">
+<w:hdr xmlns:wpc="http://schemas.microsoft.com/office/word/2010/wordprocessingCanvas" xmlns:cx="http://schemas.microsoft.com/office/drawing/2014/chartex" xmlns:cx1="http://schemas.microsoft.com/office/drawing/2015/9/8/chartex" xmlns:cx2="http://schemas.microsoft.com/office/drawing/2015/10/21/chartex" xmlns:cx3="http://schemas.microsoft.com/office/drawing/2016/5/9/chartex" xmlns:cx4="http://schemas.microsoft.com/office/drawing/2016/5/10/chartex" xmlns:cx5="http://schemas.microsoft.com/office/drawing/2016/5/11/chartex" xmlns:cx6="http://schemas.microsoft.com/office/drawing/2016/5/12/chartex" xmlns:cx7="http://schemas.microsoft.com/office/drawing/2016/5/13/chartex" xmlns:cx8="http://schemas.microsoft.com/office/drawing/2016/5/14/chartex" xmlns:mc="http://schemas.openxmlformats.org/markup-compatibility/2006" xmlns:aink="http://schemas.microsoft.com/office/drawing/2016/ink" xmlns:am3d="http://schemas.microsoft.com/office/drawing/2017/model3d" xmlns:o="urn:schemas-microsoft-com:office:office" xmlns:oel="http://schemas.microsoft.com/office/2019/extlst" xmlns:r="http://schemas.openxmlformats.org/officeDocument/2006/relationships" xmlns:m="http://schemas.openxmlformats.org/officeDocument/2006/math" xmlns:v="urn:schemas-microsoft-com:vml" xmlns:wp14="http://schemas.microsoft.com/office/word/2010/wordprocessingDrawing" xmlns:wp="http://schemas.openxmlformats.org/drawingml/2006/wordprocessingDrawing" xmlns:w10="urn:schemas-microsoft-com:office:word" xmlns:w="http://schemas.openxmlformats.org/wordprocessingml/2006/main" xmlns:w14="http://schemas.microsoft.com/office/word/2010/wordml" xmlns:w15="http://schemas.microsoft.com/office/word/2012/wordml" xmlns:w16cex="http://schemas.microsoft.com/office/word/2018/wordml/cex" xmlns:w16cid="http://schemas.microsoft.com/office/word/2016/wordml/cid" xmlns:w16="http://schemas.microsoft.com/office/word/2018/wordml" xmlns:w16du="http://schemas.microsoft.com/office/word/2023/wordml/word16du" xmlns:w16sdtdh="http://schemas.microsoft.com/office/word/2020/wordml/sdtdatahash" xmlns:w16sdtfl="http://schemas.microsoft.com/office/word/2024/wordml/sdtformatlock" xmlns:w16se="http://schemas.microsoft.com/office/word/2015/wordml/symex" xmlns:wpg="http://schemas.microsoft.com/office/word/2010/wordprocessingGroup" xmlns:wpi="http://schemas.microsoft.com/office/word/2010/wordprocessingInk" xmlns:wne="http://schemas.microsoft.com/office/word/2006/wordml" xmlns:wps="http://schemas.microsoft.com/office/word/2010/wordprocessingShape" mc:Ignorable="w14 w15 w16se w16cid w16 w16cex w16sdtdh w16sdtfl w16du wp14">
   <w:p>
     <w:pPr>
       <w:pStyle w:val="Header"/>
@@ -3830,7 +3698,7 @@
             </wp:anchor>
           </w:drawing>
         </mc:Choice>
-        <mc:Fallback xmlns:w16sdtfl="http://schemas.microsoft.com/office/word/2024/wordml/sdtformatlock" xmlns:w16du="http://schemas.microsoft.com/office/word/2023/wordml/word16du">
+        <mc:Fallback>
           <w:pict>
             <v:shapetype w14:anchorId="35676CC1" id="_x0000_t202" coordsize="21600,21600" o:spt="202" path="m,l,21600r21600,l21600,xe">
               <v:stroke joinstyle="miter"/>
@@ -3871,7 +3739,7 @@
 </file>
 
 <file path=word/header2.xml><?xml version="1.0" encoding="utf-8"?>
-<w:hdr xmlns:wpc="http://schemas.microsoft.com/office/word/2010/wordprocessingCanvas" xmlns:cx="http://schemas.microsoft.com/office/drawing/2014/chartex" xmlns:cx1="http://schemas.microsoft.com/office/drawing/2015/9/8/chartex" xmlns:cx2="http://schemas.microsoft.com/office/drawing/2015/10/21/chartex" xmlns:cx3="http://schemas.microsoft.com/office/drawing/2016/5/9/chartex" xmlns:cx4="http://schemas.microsoft.com/office/drawing/2016/5/10/chartex" xmlns:cx5="http://schemas.microsoft.com/office/drawing/2016/5/11/chartex" xmlns:cx6="http://schemas.microsoft.com/office/drawing/2016/5/12/chartex" xmlns:cx7="http://schemas.microsoft.com/office/drawing/2016/5/13/chartex" xmlns:cx8="http://schemas.microsoft.com/office/drawing/2016/5/14/chartex" xmlns:mc="http://schemas.openxmlformats.org/markup-compatibility/2006" xmlns:aink="http://schemas.microsoft.com/office/drawing/2016/ink" xmlns:am3d="http://schemas.microsoft.com/office/drawing/2017/model3d" xmlns:o="urn:schemas-microsoft-com:office:office" xmlns:oel="http://schemas.microsoft.com/office/2019/extlst" xmlns:r="http://schemas.openxmlformats.org/officeDocument/2006/relationships" xmlns:m="http://schemas.openxmlformats.org/officeDocument/2006/math" xmlns:v="urn:schemas-microsoft-com:vml" xmlns:wp14="http://schemas.microsoft.com/office/word/2010/wordprocessingDrawing" xmlns:wp="http://schemas.openxmlformats.org/drawingml/2006/wordprocessingDrawing" xmlns:w10="urn:schemas-microsoft-com:office:word" xmlns:w="http://schemas.openxmlformats.org/wordprocessingml/2006/main" xmlns:w14="http://schemas.microsoft.com/office/word/2010/wordml" xmlns:w15="http://schemas.microsoft.com/office/word/2012/wordml" xmlns:w16cex="http://schemas.microsoft.com/office/word/2018/wordml/cex" xmlns:w16cid="http://schemas.microsoft.com/office/word/2016/wordml/cid" xmlns:w16="http://schemas.microsoft.com/office/word/2018/wordml" xmlns:w16sdtdh="http://schemas.microsoft.com/office/word/2020/wordml/sdtdatahash" xmlns:w16se="http://schemas.microsoft.com/office/word/2015/wordml/symex" xmlns:wpg="http://schemas.microsoft.com/office/word/2010/wordprocessingGroup" xmlns:wpi="http://schemas.microsoft.com/office/word/2010/wordprocessingInk" xmlns:wne="http://schemas.microsoft.com/office/word/2006/wordml" xmlns:wps="http://schemas.microsoft.com/office/word/2010/wordprocessingShape" mc:Ignorable="w14 w15 w16se w16cid w16 w16cex w16sdtdh wp14">
+<w:hdr xmlns:wpc="http://schemas.microsoft.com/office/word/2010/wordprocessingCanvas" xmlns:cx="http://schemas.microsoft.com/office/drawing/2014/chartex" xmlns:cx1="http://schemas.microsoft.com/office/drawing/2015/9/8/chartex" xmlns:cx2="http://schemas.microsoft.com/office/drawing/2015/10/21/chartex" xmlns:cx3="http://schemas.microsoft.com/office/drawing/2016/5/9/chartex" xmlns:cx4="http://schemas.microsoft.com/office/drawing/2016/5/10/chartex" xmlns:cx5="http://schemas.microsoft.com/office/drawing/2016/5/11/chartex" xmlns:cx6="http://schemas.microsoft.com/office/drawing/2016/5/12/chartex" xmlns:cx7="http://schemas.microsoft.com/office/drawing/2016/5/13/chartex" xmlns:cx8="http://schemas.microsoft.com/office/drawing/2016/5/14/chartex" xmlns:mc="http://schemas.openxmlformats.org/markup-compatibility/2006" xmlns:aink="http://schemas.microsoft.com/office/drawing/2016/ink" xmlns:am3d="http://schemas.microsoft.com/office/drawing/2017/model3d" xmlns:o="urn:schemas-microsoft-com:office:office" xmlns:oel="http://schemas.microsoft.com/office/2019/extlst" xmlns:r="http://schemas.openxmlformats.org/officeDocument/2006/relationships" xmlns:m="http://schemas.openxmlformats.org/officeDocument/2006/math" xmlns:v="urn:schemas-microsoft-com:vml" xmlns:wp14="http://schemas.microsoft.com/office/word/2010/wordprocessingDrawing" xmlns:wp="http://schemas.openxmlformats.org/drawingml/2006/wordprocessingDrawing" xmlns:w10="urn:schemas-microsoft-com:office:word" xmlns:w="http://schemas.openxmlformats.org/wordprocessingml/2006/main" xmlns:w14="http://schemas.microsoft.com/office/word/2010/wordml" xmlns:w15="http://schemas.microsoft.com/office/word/2012/wordml" xmlns:w16cex="http://schemas.microsoft.com/office/word/2018/wordml/cex" xmlns:w16cid="http://schemas.microsoft.com/office/word/2016/wordml/cid" xmlns:w16="http://schemas.microsoft.com/office/word/2018/wordml" xmlns:w16du="http://schemas.microsoft.com/office/word/2023/wordml/word16du" xmlns:w16sdtdh="http://schemas.microsoft.com/office/word/2020/wordml/sdtdatahash" xmlns:w16sdtfl="http://schemas.microsoft.com/office/word/2024/wordml/sdtformatlock" xmlns:w16se="http://schemas.microsoft.com/office/word/2015/wordml/symex" xmlns:wpg="http://schemas.microsoft.com/office/word/2010/wordprocessingGroup" xmlns:wpi="http://schemas.microsoft.com/office/word/2010/wordprocessingInk" xmlns:wne="http://schemas.microsoft.com/office/word/2006/wordml" xmlns:wps="http://schemas.microsoft.com/office/word/2010/wordprocessingShape" mc:Ignorable="w14 w15 w16se w16cid w16 w16cex w16sdtdh w16sdtfl w16du wp14">
   <w:p>
     <w:pPr>
       <w:pStyle w:val="Header"/>
@@ -3956,7 +3824,7 @@
             </wp:anchor>
           </w:drawing>
         </mc:Choice>
-        <mc:Fallback xmlns:w16sdtfl="http://schemas.microsoft.com/office/word/2024/wordml/sdtformatlock" xmlns:w16du="http://schemas.microsoft.com/office/word/2023/wordml/word16du">
+        <mc:Fallback>
           <w:pict>
             <v:shapetype w14:anchorId="28B07D3E" id="_x0000_t202" coordsize="21600,21600" o:spt="202" path="m,l,21600r21600,l21600,xe">
               <v:stroke joinstyle="miter"/>
@@ -3997,7 +3865,7 @@
 </file>
 
 <file path=word/header3.xml><?xml version="1.0" encoding="utf-8"?>
-<w:hdr xmlns:wpc="http://schemas.microsoft.com/office/word/2010/wordprocessingCanvas" xmlns:cx="http://schemas.microsoft.com/office/drawing/2014/chartex" xmlns:cx1="http://schemas.microsoft.com/office/drawing/2015/9/8/chartex" xmlns:cx2="http://schemas.microsoft.com/office/drawing/2015/10/21/chartex" xmlns:cx3="http://schemas.microsoft.com/office/drawing/2016/5/9/chartex" xmlns:cx4="http://schemas.microsoft.com/office/drawing/2016/5/10/chartex" xmlns:cx5="http://schemas.microsoft.com/office/drawing/2016/5/11/chartex" xmlns:cx6="http://schemas.microsoft.com/office/drawing/2016/5/12/chartex" xmlns:cx7="http://schemas.microsoft.com/office/drawing/2016/5/13/chartex" xmlns:cx8="http://schemas.microsoft.com/office/drawing/2016/5/14/chartex" xmlns:mc="http://schemas.openxmlformats.org/markup-compatibility/2006" xmlns:aink="http://schemas.microsoft.com/office/drawing/2016/ink" xmlns:am3d="http://schemas.microsoft.com/office/drawing/2017/model3d" xmlns:o="urn:schemas-microsoft-com:office:office" xmlns:oel="http://schemas.microsoft.com/office/2019/extlst" xmlns:r="http://schemas.openxmlformats.org/officeDocument/2006/relationships" xmlns:m="http://schemas.openxmlformats.org/officeDocument/2006/math" xmlns:v="urn:schemas-microsoft-com:vml" xmlns:wp14="http://schemas.microsoft.com/office/word/2010/wordprocessingDrawing" xmlns:wp="http://schemas.openxmlformats.org/drawingml/2006/wordprocessingDrawing" xmlns:w10="urn:schemas-microsoft-com:office:word" xmlns:w="http://schemas.openxmlformats.org/wordprocessingml/2006/main" xmlns:w14="http://schemas.microsoft.com/office/word/2010/wordml" xmlns:w15="http://schemas.microsoft.com/office/word/2012/wordml" xmlns:w16cex="http://schemas.microsoft.com/office/word/2018/wordml/cex" xmlns:w16cid="http://schemas.microsoft.com/office/word/2016/wordml/cid" xmlns:w16="http://schemas.microsoft.com/office/word/2018/wordml" xmlns:w16sdtdh="http://schemas.microsoft.com/office/word/2020/wordml/sdtdatahash" xmlns:w16se="http://schemas.microsoft.com/office/word/2015/wordml/symex" xmlns:wpg="http://schemas.microsoft.com/office/word/2010/wordprocessingGroup" xmlns:wpi="http://schemas.microsoft.com/office/word/2010/wordprocessingInk" xmlns:wne="http://schemas.microsoft.com/office/word/2006/wordml" xmlns:wps="http://schemas.microsoft.com/office/word/2010/wordprocessingShape" mc:Ignorable="w14 w15 w16se w16cid w16 w16cex w16sdtdh wp14">
+<w:hdr xmlns:wpc="http://schemas.microsoft.com/office/word/2010/wordprocessingCanvas" xmlns:cx="http://schemas.microsoft.com/office/drawing/2014/chartex" xmlns:cx1="http://schemas.microsoft.com/office/drawing/2015/9/8/chartex" xmlns:cx2="http://schemas.microsoft.com/office/drawing/2015/10/21/chartex" xmlns:cx3="http://schemas.microsoft.com/office/drawing/2016/5/9/chartex" xmlns:cx4="http://schemas.microsoft.com/office/drawing/2016/5/10/chartex" xmlns:cx5="http://schemas.microsoft.com/office/drawing/2016/5/11/chartex" xmlns:cx6="http://schemas.microsoft.com/office/drawing/2016/5/12/chartex" xmlns:cx7="http://schemas.microsoft.com/office/drawing/2016/5/13/chartex" xmlns:cx8="http://schemas.microsoft.com/office/drawing/2016/5/14/chartex" xmlns:mc="http://schemas.openxmlformats.org/markup-compatibility/2006" xmlns:aink="http://schemas.microsoft.com/office/drawing/2016/ink" xmlns:am3d="http://schemas.microsoft.com/office/drawing/2017/model3d" xmlns:o="urn:schemas-microsoft-com:office:office" xmlns:oel="http://schemas.microsoft.com/office/2019/extlst" xmlns:r="http://schemas.openxmlformats.org/officeDocument/2006/relationships" xmlns:m="http://schemas.openxmlformats.org/officeDocument/2006/math" xmlns:v="urn:schemas-microsoft-com:vml" xmlns:wp14="http://schemas.microsoft.com/office/word/2010/wordprocessingDrawing" xmlns:wp="http://schemas.openxmlformats.org/drawingml/2006/wordprocessingDrawing" xmlns:w10="urn:schemas-microsoft-com:office:word" xmlns:w="http://schemas.openxmlformats.org/wordprocessingml/2006/main" xmlns:w14="http://schemas.microsoft.com/office/word/2010/wordml" xmlns:w15="http://schemas.microsoft.com/office/word/2012/wordml" xmlns:w16cex="http://schemas.microsoft.com/office/word/2018/wordml/cex" xmlns:w16cid="http://schemas.microsoft.com/office/word/2016/wordml/cid" xmlns:w16="http://schemas.microsoft.com/office/word/2018/wordml" xmlns:w16du="http://schemas.microsoft.com/office/word/2023/wordml/word16du" xmlns:w16sdtdh="http://schemas.microsoft.com/office/word/2020/wordml/sdtdatahash" xmlns:w16sdtfl="http://schemas.microsoft.com/office/word/2024/wordml/sdtformatlock" xmlns:w16se="http://schemas.microsoft.com/office/word/2015/wordml/symex" xmlns:wpg="http://schemas.microsoft.com/office/word/2010/wordprocessingGroup" xmlns:wpi="http://schemas.microsoft.com/office/word/2010/wordprocessingInk" xmlns:wne="http://schemas.microsoft.com/office/word/2006/wordml" xmlns:wps="http://schemas.microsoft.com/office/word/2010/wordprocessingShape" mc:Ignorable="w14 w15 w16se w16cid w16 w16cex w16sdtdh w16sdtfl w16du wp14">
   <w:p>
     <w:pPr>
       <w:pStyle w:val="Header"/>
@@ -4081,7 +3949,7 @@
             </wp:anchor>
           </w:drawing>
         </mc:Choice>
-        <mc:Fallback xmlns:w16sdtfl="http://schemas.microsoft.com/office/word/2024/wordml/sdtformatlock" xmlns:w16du="http://schemas.microsoft.com/office/word/2023/wordml/word16du">
+        <mc:Fallback>
           <w:pict>
             <v:shapetype w14:anchorId="4A2D593D" id="_x0000_t202" coordsize="21600,21600" o:spt="202" path="m,l,21600r21600,l21600,xe">
               <v:stroke joinstyle="miter"/>
@@ -4127,7 +3995,7 @@
 </file>
 
 <file path=word/numbering.xml><?xml version="1.0" encoding="utf-8"?>
-<w:numbering xmlns:wpc="http://schemas.microsoft.com/office/word/2010/wordprocessingCanvas" xmlns:cx="http://schemas.microsoft.com/office/drawing/2014/chartex" xmlns:cx1="http://schemas.microsoft.com/office/drawing/2015/9/8/chartex" xmlns:cx2="http://schemas.microsoft.com/office/drawing/2015/10/21/chartex" xmlns:cx3="http://schemas.microsoft.com/office/drawing/2016/5/9/chartex" xmlns:cx4="http://schemas.microsoft.com/office/drawing/2016/5/10/chartex" xmlns:cx5="http://schemas.microsoft.com/office/drawing/2016/5/11/chartex" xmlns:cx6="http://schemas.microsoft.com/office/drawing/2016/5/12/chartex" xmlns:cx7="http://schemas.microsoft.com/office/drawing/2016/5/13/chartex" xmlns:cx8="http://schemas.microsoft.com/office/drawing/2016/5/14/chartex" xmlns:mc="http://schemas.openxmlformats.org/markup-compatibility/2006" xmlns:aink="http://schemas.microsoft.com/office/drawing/2016/ink" xmlns:am3d="http://schemas.microsoft.com/office/drawing/2017/model3d" xmlns:o="urn:schemas-microsoft-com:office:office" xmlns:oel="http://schemas.microsoft.com/office/2019/extlst" xmlns:r="http://schemas.openxmlformats.org/officeDocument/2006/relationships" xmlns:m="http://schemas.openxmlformats.org/officeDocument/2006/math" xmlns:v="urn:schemas-microsoft-com:vml" xmlns:wp14="http://schemas.microsoft.com/office/word/2010/wordprocessingDrawing" xmlns:wp="http://schemas.openxmlformats.org/drawingml/2006/wordprocessingDrawing" xmlns:w10="urn:schemas-microsoft-com:office:word" xmlns:w="http://schemas.openxmlformats.org/wordprocessingml/2006/main" xmlns:w14="http://schemas.microsoft.com/office/word/2010/wordml" xmlns:w15="http://schemas.microsoft.com/office/word/2012/wordml" xmlns:w16cex="http://schemas.microsoft.com/office/word/2018/wordml/cex" xmlns:w16cid="http://schemas.microsoft.com/office/word/2016/wordml/cid" xmlns:w16="http://schemas.microsoft.com/office/word/2018/wordml" xmlns:w16sdtdh="http://schemas.microsoft.com/office/word/2020/wordml/sdtdatahash" xmlns:w16se="http://schemas.microsoft.com/office/word/2015/wordml/symex" xmlns:wpg="http://schemas.microsoft.com/office/word/2010/wordprocessingGroup" xmlns:wpi="http://schemas.microsoft.com/office/word/2010/wordprocessingInk" xmlns:wne="http://schemas.microsoft.com/office/word/2006/wordml" xmlns:wps="http://schemas.microsoft.com/office/word/2010/wordprocessingShape" mc:Ignorable="w14 w15 w16se w16cid w16 w16cex w16sdtdh wp14">
+<w:numbering xmlns:wpc="http://schemas.microsoft.com/office/word/2010/wordprocessingCanvas" xmlns:cx="http://schemas.microsoft.com/office/drawing/2014/chartex" xmlns:cx1="http://schemas.microsoft.com/office/drawing/2015/9/8/chartex" xmlns:cx2="http://schemas.microsoft.com/office/drawing/2015/10/21/chartex" xmlns:cx3="http://schemas.microsoft.com/office/drawing/2016/5/9/chartex" xmlns:cx4="http://schemas.microsoft.com/office/drawing/2016/5/10/chartex" xmlns:cx5="http://schemas.microsoft.com/office/drawing/2016/5/11/chartex" xmlns:cx6="http://schemas.microsoft.com/office/drawing/2016/5/12/chartex" xmlns:cx7="http://schemas.microsoft.com/office/drawing/2016/5/13/chartex" xmlns:cx8="http://schemas.microsoft.com/office/drawing/2016/5/14/chartex" xmlns:mc="http://schemas.openxmlformats.org/markup-compatibility/2006" xmlns:aink="http://schemas.microsoft.com/office/drawing/2016/ink" xmlns:am3d="http://schemas.microsoft.com/office/drawing/2017/model3d" xmlns:o="urn:schemas-microsoft-com:office:office" xmlns:oel="http://schemas.microsoft.com/office/2019/extlst" xmlns:r="http://schemas.openxmlformats.org/officeDocument/2006/relationships" xmlns:m="http://schemas.openxmlformats.org/officeDocument/2006/math" xmlns:v="urn:schemas-microsoft-com:vml" xmlns:wp14="http://schemas.microsoft.com/office/word/2010/wordprocessingDrawing" xmlns:wp="http://schemas.openxmlformats.org/drawingml/2006/wordprocessingDrawing" xmlns:w10="urn:schemas-microsoft-com:office:word" xmlns:w="http://schemas.openxmlformats.org/wordprocessingml/2006/main" xmlns:w14="http://schemas.microsoft.com/office/word/2010/wordml" xmlns:w15="http://schemas.microsoft.com/office/word/2012/wordml" xmlns:w16cex="http://schemas.microsoft.com/office/word/2018/wordml/cex" xmlns:w16cid="http://schemas.microsoft.com/office/word/2016/wordml/cid" xmlns:w16="http://schemas.microsoft.com/office/word/2018/wordml" xmlns:w16du="http://schemas.microsoft.com/office/word/2023/wordml/word16du" xmlns:w16sdtdh="http://schemas.microsoft.com/office/word/2020/wordml/sdtdatahash" xmlns:w16sdtfl="http://schemas.microsoft.com/office/word/2024/wordml/sdtformatlock" xmlns:w16se="http://schemas.microsoft.com/office/word/2015/wordml/symex" xmlns:wpg="http://schemas.microsoft.com/office/word/2010/wordprocessingGroup" xmlns:wpi="http://schemas.microsoft.com/office/word/2010/wordprocessingInk" xmlns:wne="http://schemas.microsoft.com/office/word/2006/wordml" xmlns:wps="http://schemas.microsoft.com/office/word/2010/wordprocessingShape" mc:Ignorable="w14 w15 w16se w16cid w16 w16cex w16sdtdh w16sdtfl w16du wp14">
   <w:abstractNum w:abstractNumId="0" w15:restartNumberingAfterBreak="0">
     <w:nsid w:val="02A51885"/>
     <w:multiLevelType w:val="hybridMultilevel"/>
@@ -8781,7 +8649,7 @@
 </file>
 
 <file path=word/styles.xml><?xml version="1.0" encoding="utf-8"?>
-<w:styles xmlns:mc="http://schemas.openxmlformats.org/markup-compatibility/2006" xmlns:r="http://schemas.openxmlformats.org/officeDocument/2006/relationships" xmlns:w="http://schemas.openxmlformats.org/wordprocessingml/2006/main" xmlns:w14="http://schemas.microsoft.com/office/word/2010/wordml" xmlns:w15="http://schemas.microsoft.com/office/word/2012/wordml" xmlns:w16cex="http://schemas.microsoft.com/office/word/2018/wordml/cex" xmlns:w16cid="http://schemas.microsoft.com/office/word/2016/wordml/cid" xmlns:w16="http://schemas.microsoft.com/office/word/2018/wordml" xmlns:w16sdtdh="http://schemas.microsoft.com/office/word/2020/wordml/sdtdatahash" xmlns:w16se="http://schemas.microsoft.com/office/word/2015/wordml/symex" mc:Ignorable="w14 w15 w16se w16cid w16 w16cex w16sdtdh">
+<w:styles xmlns:mc="http://schemas.openxmlformats.org/markup-compatibility/2006" xmlns:r="http://schemas.openxmlformats.org/officeDocument/2006/relationships" xmlns:w="http://schemas.openxmlformats.org/wordprocessingml/2006/main" xmlns:w14="http://schemas.microsoft.com/office/word/2010/wordml" xmlns:w15="http://schemas.microsoft.com/office/word/2012/wordml" xmlns:w16cex="http://schemas.microsoft.com/office/word/2018/wordml/cex" xmlns:w16cid="http://schemas.microsoft.com/office/word/2016/wordml/cid" xmlns:w16="http://schemas.microsoft.com/office/word/2018/wordml" xmlns:w16du="http://schemas.microsoft.com/office/word/2023/wordml/word16du" xmlns:w16sdtdh="http://schemas.microsoft.com/office/word/2020/wordml/sdtdatahash" xmlns:w16sdtfl="http://schemas.microsoft.com/office/word/2024/wordml/sdtformatlock" xmlns:w16se="http://schemas.microsoft.com/office/word/2015/wordml/symex" mc:Ignorable="w14 w15 w16se w16cid w16 w16cex w16sdtdh w16sdtfl w16du">
   <w:docDefaults>
     <w:rPrDefault>
       <w:rPr>
@@ -11090,6 +10958,10 @@
 </file>
 
 <file path=customXml/item1.xml><?xml version="1.0" encoding="utf-8"?>
+<b:Sources xmlns:b="http://schemas.openxmlformats.org/officeDocument/2006/bibliography" xmlns="http://schemas.openxmlformats.org/officeDocument/2006/bibliography" SelectedStyle="\MLA.XSL" StyleName="MLA"/>
+</file>
+
+<file path=customXml/item2.xml><?xml version="1.0" encoding="utf-8"?>
 <ct:contentTypeSchema xmlns:ct="http://schemas.microsoft.com/office/2006/metadata/contentType" xmlns:ma="http://schemas.microsoft.com/office/2006/metadata/properties/metaAttributes" ct:_="" ma:_="" ma:contentTypeName="Document" ma:contentTypeID="0x01010088CE47F754C76E4E816A66E05339225A" ma:contentTypeVersion="13" ma:contentTypeDescription="Create a new document." ma:contentTypeScope="" ma:versionID="076a7d54fdb0b635cd2e2f75f54c1b16">
   <xsd:schema xmlns:xsd="http://www.w3.org/2001/XMLSchema" xmlns:xs="http://www.w3.org/2001/XMLSchema" xmlns:p="http://schemas.microsoft.com/office/2006/metadata/properties" xmlns:ns1="http://schemas.microsoft.com/sharepoint/v3" xmlns:ns2="72f5c66d-4f9b-4523-9c59-0147434cba56" xmlns:ns3="d5671106-6e7e-4942-8aee-9bcd5dd7e66b" targetNamespace="http://schemas.microsoft.com/office/2006/metadata/properties" ma:root="true" ma:fieldsID="733d59cbe7e7cf634dfb746df9f4de01" ns1:_="" ns2:_="" ns3:_="">
     <xsd:import namespace="http://schemas.microsoft.com/sharepoint/v3"/>
@@ -11301,20 +11173,7 @@
 </ct:contentTypeSchema>
 </file>
 
-<file path=customXml/item2.xml><?xml version="1.0" encoding="utf-8"?>
-<b:Sources xmlns:b="http://schemas.openxmlformats.org/officeDocument/2006/bibliography" xmlns="http://schemas.openxmlformats.org/officeDocument/2006/bibliography" SelectedStyle="\MLA.XSL" StyleName="MLA"/>
-</file>
-
 <file path=customXml/item3.xml><?xml version="1.0" encoding="utf-8"?>
-<?mso-contentType ?>
-<FormTemplates xmlns="http://schemas.microsoft.com/sharepoint/v3/contenttype/forms">
-  <Display>DocumentLibraryForm</Display>
-  <Edit>DocumentLibraryForm</Edit>
-  <New>DocumentLibraryForm</New>
-</FormTemplates>
-</file>
-
-<file path=customXml/item4.xml><?xml version="1.0" encoding="utf-8"?>
 <p:properties xmlns:p="http://schemas.microsoft.com/office/2006/metadata/properties" xmlns:xsi="http://www.w3.org/2001/XMLSchema-instance" xmlns:pc="http://schemas.microsoft.com/office/infopath/2007/PartnerControls">
   <documentManagement>
     <_ip_UnifiedCompliancePolicyUIAction xmlns="http://schemas.microsoft.com/sharepoint/v3" xsi:nil="true"/>
@@ -11327,7 +11186,24 @@
 </p:properties>
 </file>
 
+<file path=customXml/item4.xml><?xml version="1.0" encoding="utf-8"?>
+<?mso-contentType ?>
+<FormTemplates xmlns="http://schemas.microsoft.com/sharepoint/v3/contenttype/forms">
+  <Display>DocumentLibraryForm</Display>
+  <Edit>DocumentLibraryForm</Edit>
+  <New>DocumentLibraryForm</New>
+</FormTemplates>
+</file>
+
 <file path=customXml/itemProps1.xml><?xml version="1.0" encoding="utf-8"?>
+<ds:datastoreItem xmlns:ds="http://schemas.openxmlformats.org/officeDocument/2006/customXml" ds:itemID="{6A404842-743E-4BBC-99A7-70A911F17733}">
+  <ds:schemaRefs>
+    <ds:schemaRef ds:uri="http://schemas.openxmlformats.org/officeDocument/2006/bibliography"/>
+  </ds:schemaRefs>
+</ds:datastoreItem>
+</file>
+
+<file path=customXml/itemProps2.xml><?xml version="1.0" encoding="utf-8"?>
 <ds:datastoreItem xmlns:ds="http://schemas.openxmlformats.org/officeDocument/2006/customXml" ds:itemID="{77819383-3D86-46CF-A5E7-D6F9C756A7E0}">
   <ds:schemaRefs>
     <ds:schemaRef ds:uri="http://schemas.microsoft.com/office/2006/metadata/contentType"/>
@@ -11347,23 +11223,7 @@
 </ds:datastoreItem>
 </file>
 
-<file path=customXml/itemProps2.xml><?xml version="1.0" encoding="utf-8"?>
-<ds:datastoreItem xmlns:ds="http://schemas.openxmlformats.org/officeDocument/2006/customXml" ds:itemID="{6A404842-743E-4BBC-99A7-70A911F17733}">
-  <ds:schemaRefs>
-    <ds:schemaRef ds:uri="http://schemas.openxmlformats.org/officeDocument/2006/bibliography"/>
-  </ds:schemaRefs>
-</ds:datastoreItem>
-</file>
-
 <file path=customXml/itemProps3.xml><?xml version="1.0" encoding="utf-8"?>
-<ds:datastoreItem xmlns:ds="http://schemas.openxmlformats.org/officeDocument/2006/customXml" ds:itemID="{C793F174-B33D-4AAE-9E3B-9A362A6F4892}">
-  <ds:schemaRefs>
-    <ds:schemaRef ds:uri="http://schemas.microsoft.com/sharepoint/v3/contenttype/forms"/>
-  </ds:schemaRefs>
-</ds:datastoreItem>
-</file>
-
-<file path=customXml/itemProps4.xml><?xml version="1.0" encoding="utf-8"?>
 <ds:datastoreItem xmlns:ds="http://schemas.openxmlformats.org/officeDocument/2006/customXml" ds:itemID="{2FE68222-D1D7-4405-9D8B-445901EEA94E}">
   <ds:schemaRefs>
     <ds:schemaRef ds:uri="http://schemas.microsoft.com/office/2006/metadata/properties"/>
@@ -11373,4 +11233,12 @@
     <ds:schemaRef ds:uri="d5671106-6e7e-4942-8aee-9bcd5dd7e66b"/>
   </ds:schemaRefs>
 </ds:datastoreItem>
+</file>
+
+<file path=customXml/itemProps4.xml><?xml version="1.0" encoding="utf-8"?>
+<ds:datastoreItem xmlns:ds="http://schemas.openxmlformats.org/officeDocument/2006/customXml" ds:itemID="{C793F174-B33D-4AAE-9E3B-9A362A6F4892}">
+  <ds:schemaRefs>
+    <ds:schemaRef ds:uri="http://schemas.microsoft.com/sharepoint/v3/contenttype/forms"/>
+  </ds:schemaRefs>
+</ds:datastoreItem>
 </file>
</xml_diff>